<commit_message>
atualização da aula 01/10/26
</commit_message>
<xml_diff>
--- a/apostila/Projeto Space for me3 (Recuperação Automática).docx
+++ b/apostila/Projeto Space for me3 (Recuperação Automática).docx
@@ -13442,15 +13442,880 @@
           </wp:inline>
         </w:drawing>
       </w:r>
+    </w:p>
+    <w:p>
+      <w:pPr>
+        <w:rPr>
+          <w:noProof/>
+        </w:rPr>
+      </w:pPr>
+      <w:r>
+        <w:rPr>
+          <w:noProof/>
+        </w:rPr>
+        <w:t>103- Adicionamos uma class para a lista que esta dentro da seção benefícios.</w:t>
+      </w:r>
+    </w:p>
+    <w:p>
+      <w:pPr>
+        <w:rPr>
+          <w:noProof/>
+        </w:rPr>
+      </w:pPr>
+    </w:p>
+    <w:p>
+      <w:pPr>
+        <w:rPr>
+          <w:noProof/>
+        </w:rPr>
+      </w:pPr>
+      <w:r>
+        <w:rPr>
+          <w:noProof/>
+        </w:rPr>
+        <w:t>104-</w:t>
+      </w:r>
+      <w:r>
+        <w:rPr>
+          <w:noProof/>
+        </w:rPr>
+        <w:t xml:space="preserve"> Após colocar</w:t>
+      </w:r>
+      <w:r>
+        <w:rPr>
+          <w:noProof/>
+        </w:rPr>
+        <w:drawing>
+          <wp:inline distT="0" distB="0" distL="0" distR="0" wp14:anchorId="21ACF518" wp14:editId="034354C4">
+            <wp:extent cx="3000375" cy="1343025"/>
+            <wp:effectExtent l="0" t="0" r="9525" b="9525"/>
+            <wp:docPr id="199" name="Imagem 199"/>
+            <wp:cNvGraphicFramePr>
+              <a:graphicFrameLocks xmlns:a="http://schemas.openxmlformats.org/drawingml/2006/main" noChangeAspect="1"/>
+            </wp:cNvGraphicFramePr>
+            <a:graphic xmlns:a="http://schemas.openxmlformats.org/drawingml/2006/main">
+              <a:graphicData uri="http://schemas.openxmlformats.org/drawingml/2006/picture">
+                <pic:pic xmlns:pic="http://schemas.openxmlformats.org/drawingml/2006/picture">
+                  <pic:nvPicPr>
+                    <pic:cNvPr id="1" name=""/>
+                    <pic:cNvPicPr/>
+                  </pic:nvPicPr>
+                  <pic:blipFill>
+                    <a:blip r:embed="rId166"/>
+                    <a:stretch>
+                      <a:fillRect/>
+                    </a:stretch>
+                  </pic:blipFill>
+                  <pic:spPr>
+                    <a:xfrm>
+                      <a:off x="0" y="0"/>
+                      <a:ext cx="3000800" cy="1343215"/>
+                    </a:xfrm>
+                    <a:prstGeom prst="rect">
+                      <a:avLst/>
+                    </a:prstGeom>
+                  </pic:spPr>
+                </pic:pic>
+              </a:graphicData>
+            </a:graphic>
+          </wp:inline>
+        </w:drawing>
+      </w:r>
+      <w:r>
+        <w:rPr>
+          <w:noProof/>
+        </w:rPr>
+        <w:t xml:space="preserve"> uma class na lista definimos o tamanho a largura para 40% com intuito de colocar a lista ao lado da imagem benefícios depois mudamos a natureza da lista para ficar inline-block, notamos que quanto estamos trabalhando com 100% de espaço:</w:t>
+      </w:r>
+    </w:p>
+    <w:p>
+      <w:pPr>
+        <w:pStyle w:val="PargrafodaLista"/>
+        <w:numPr>
+          <w:ilvl w:val="0"/>
+          <w:numId w:val="3"/>
+        </w:numPr>
+        <w:rPr>
+          <w:noProof/>
+        </w:rPr>
+      </w:pPr>
+      <w:r>
+        <w:rPr>
+          <w:noProof/>
+        </w:rPr>
+        <w:t>Lista com 40% de largura</w:t>
+      </w:r>
+    </w:p>
+    <w:p>
+      <w:pPr>
+        <w:pStyle w:val="PargrafodaLista"/>
+        <w:numPr>
+          <w:ilvl w:val="0"/>
+          <w:numId w:val="3"/>
+        </w:numPr>
+        <w:rPr>
+          <w:noProof/>
+        </w:rPr>
+      </w:pPr>
+      <w:r>
+        <w:rPr>
+          <w:noProof/>
+        </w:rPr>
+        <w:t>A imagem com 60% de largura.</w:t>
+      </w:r>
+    </w:p>
+    <w:p>
+      <w:pPr>
+        <w:pStyle w:val="PargrafodaLista"/>
+        <w:rPr>
+          <w:noProof/>
+        </w:rPr>
+      </w:pPr>
+      <w:r>
+        <w:rPr>
+          <w:noProof/>
+        </w:rPr>
+        <w:t>Se faz necessário não deixar espaço no html entre a lista e a imagem.</w:t>
+      </w:r>
+    </w:p>
+    <w:p>
+      <w:pPr>
+        <w:pStyle w:val="PargrafodaLista"/>
+        <w:rPr>
+          <w:noProof/>
+        </w:rPr>
+      </w:pPr>
+      <w:r>
+        <w:rPr>
+          <w:noProof/>
+        </w:rPr>
+        <w:drawing>
+          <wp:inline distT="0" distB="0" distL="0" distR="0" wp14:anchorId="67AF1A0E" wp14:editId="047A4325">
+            <wp:extent cx="4438650" cy="1562100"/>
+            <wp:effectExtent l="0" t="0" r="0" b="0"/>
+            <wp:docPr id="201" name="Imagem 201"/>
+            <wp:cNvGraphicFramePr>
+              <a:graphicFrameLocks xmlns:a="http://schemas.openxmlformats.org/drawingml/2006/main" noChangeAspect="1"/>
+            </wp:cNvGraphicFramePr>
+            <a:graphic xmlns:a="http://schemas.openxmlformats.org/drawingml/2006/main">
+              <a:graphicData uri="http://schemas.openxmlformats.org/drawingml/2006/picture">
+                <pic:pic xmlns:pic="http://schemas.openxmlformats.org/drawingml/2006/picture">
+                  <pic:nvPicPr>
+                    <pic:cNvPr id="1" name=""/>
+                    <pic:cNvPicPr/>
+                  </pic:nvPicPr>
+                  <pic:blipFill>
+                    <a:blip r:embed="rId167"/>
+                    <a:stretch>
+                      <a:fillRect/>
+                    </a:stretch>
+                  </pic:blipFill>
+                  <pic:spPr>
+                    <a:xfrm>
+                      <a:off x="0" y="0"/>
+                      <a:ext cx="4439270" cy="1562318"/>
+                    </a:xfrm>
+                    <a:prstGeom prst="rect">
+                      <a:avLst/>
+                    </a:prstGeom>
+                  </pic:spPr>
+                </pic:pic>
+              </a:graphicData>
+            </a:graphic>
+          </wp:inline>
+        </w:drawing>
+      </w:r>
+      <w:r>
+        <w:rPr>
+          <w:noProof/>
+        </w:rPr>
+        <w:drawing>
+          <wp:inline distT="0" distB="0" distL="0" distR="0" wp14:anchorId="16B25D7F" wp14:editId="53B9868F">
+            <wp:extent cx="2095792" cy="924054"/>
+            <wp:effectExtent l="0" t="0" r="0" b="9525"/>
+            <wp:docPr id="200" name="Imagem 200"/>
+            <wp:cNvGraphicFramePr>
+              <a:graphicFrameLocks xmlns:a="http://schemas.openxmlformats.org/drawingml/2006/main" noChangeAspect="1"/>
+            </wp:cNvGraphicFramePr>
+            <a:graphic xmlns:a="http://schemas.openxmlformats.org/drawingml/2006/main">
+              <a:graphicData uri="http://schemas.openxmlformats.org/drawingml/2006/picture">
+                <pic:pic xmlns:pic="http://schemas.openxmlformats.org/drawingml/2006/picture">
+                  <pic:nvPicPr>
+                    <pic:cNvPr id="1" name=""/>
+                    <pic:cNvPicPr/>
+                  </pic:nvPicPr>
+                  <pic:blipFill>
+                    <a:blip r:embed="rId168"/>
+                    <a:stretch>
+                      <a:fillRect/>
+                    </a:stretch>
+                  </pic:blipFill>
+                  <pic:spPr>
+                    <a:xfrm>
+                      <a:off x="0" y="0"/>
+                      <a:ext cx="2095792" cy="924054"/>
+                    </a:xfrm>
+                    <a:prstGeom prst="rect">
+                      <a:avLst/>
+                    </a:prstGeom>
+                  </pic:spPr>
+                </pic:pic>
+              </a:graphicData>
+            </a:graphic>
+          </wp:inline>
+        </w:drawing>
+      </w:r>
+    </w:p>
+    <w:p>
+      <w:pPr>
+        <w:pStyle w:val="PargrafodaLista"/>
+        <w:rPr>
+          <w:noProof/>
+        </w:rPr>
+      </w:pPr>
+      <w:r>
+        <w:rPr>
+          <w:noProof/>
+        </w:rPr>
+        <w:t>105- Alinhamos a lista no topo da imagem</w:t>
+      </w:r>
+      <w:r>
+        <w:rPr>
+          <w:noProof/>
+        </w:rPr>
+        <w:t xml:space="preserve"> utilizando vertical-aling:top , incluimos mais dois itens a lista no html e colocamos um espaço entre os itens da lista.</w:t>
+      </w:r>
+    </w:p>
+    <w:p>
+      <w:pPr>
+        <w:pStyle w:val="PargrafodaLista"/>
+        <w:rPr>
+          <w:noProof/>
+        </w:rPr>
+      </w:pPr>
+      <w:r>
+        <w:rPr>
+          <w:noProof/>
+        </w:rPr>
+        <mc:AlternateContent>
+          <mc:Choice Requires="wps">
+            <w:drawing>
+              <wp:anchor distT="0" distB="0" distL="114300" distR="114300" simplePos="0" relativeHeight="251706368" behindDoc="0" locked="0" layoutInCell="1" allowOverlap="1" wp14:anchorId="7EDAB310" wp14:editId="09A97924">
+                <wp:simplePos x="0" y="0"/>
+                <wp:positionH relativeFrom="column">
+                  <wp:posOffset>2257425</wp:posOffset>
+                </wp:positionH>
+                <wp:positionV relativeFrom="paragraph">
+                  <wp:posOffset>1316990</wp:posOffset>
+                </wp:positionV>
+                <wp:extent cx="504825" cy="114300"/>
+                <wp:effectExtent l="38100" t="0" r="28575" b="76200"/>
+                <wp:wrapNone/>
+                <wp:docPr id="204" name="Conector de Seta Reta 204"/>
+                <wp:cNvGraphicFramePr/>
+                <a:graphic xmlns:a="http://schemas.openxmlformats.org/drawingml/2006/main">
+                  <a:graphicData uri="http://schemas.microsoft.com/office/word/2010/wordprocessingShape">
+                    <wps:wsp>
+                      <wps:cNvCnPr/>
+                      <wps:spPr>
+                        <a:xfrm flipH="1">
+                          <a:off x="0" y="0"/>
+                          <a:ext cx="504825" cy="114300"/>
+                        </a:xfrm>
+                        <a:prstGeom prst="straightConnector1">
+                          <a:avLst/>
+                        </a:prstGeom>
+                        <a:ln>
+                          <a:tailEnd type="triangle"/>
+                        </a:ln>
+                      </wps:spPr>
+                      <wps:style>
+                        <a:lnRef idx="1">
+                          <a:schemeClr val="accent1"/>
+                        </a:lnRef>
+                        <a:fillRef idx="0">
+                          <a:schemeClr val="accent1"/>
+                        </a:fillRef>
+                        <a:effectRef idx="0">
+                          <a:schemeClr val="accent1"/>
+                        </a:effectRef>
+                        <a:fontRef idx="minor">
+                          <a:schemeClr val="tx1"/>
+                        </a:fontRef>
+                      </wps:style>
+                      <wps:bodyPr/>
+                    </wps:wsp>
+                  </a:graphicData>
+                </a:graphic>
+              </wp:anchor>
+            </w:drawing>
+          </mc:Choice>
+          <mc:Fallback>
+            <w:pict>
+              <v:shapetype w14:anchorId="34B5F403" id="_x0000_t32" coordsize="21600,21600" o:spt="32" o:oned="t" path="m,l21600,21600e" filled="f">
+                <v:path arrowok="t" fillok="f" o:connecttype="none"/>
+                <o:lock v:ext="edit" shapetype="t"/>
+              </v:shapetype>
+              <v:shape id="Conector de Seta Reta 204" o:spid="_x0000_s1026" type="#_x0000_t32" style="position:absolute;margin-left:177.75pt;margin-top:103.7pt;width:39.75pt;height:9pt;flip:x;z-index:251706368;visibility:visible;mso-wrap-style:square;mso-wrap-distance-left:9pt;mso-wrap-distance-top:0;mso-wrap-distance-right:9pt;mso-wrap-distance-bottom:0;mso-position-horizontal:absolute;mso-position-horizontal-relative:text;mso-position-vertical:absolute;mso-position-vertical-relative:text" o:gfxdata="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" strokecolor="#4472c4 [3204]" strokeweight=".5pt">
+                <v:stroke endarrow="block" joinstyle="miter"/>
+              </v:shape>
+            </w:pict>
+          </mc:Fallback>
+        </mc:AlternateContent>
+      </w:r>
+      <w:r>
+        <w:rPr>
+          <w:noProof/>
+        </w:rPr>
+        <mc:AlternateContent>
+          <mc:Choice Requires="wps">
+            <w:drawing>
+              <wp:anchor distT="0" distB="0" distL="114300" distR="114300" simplePos="0" relativeHeight="251705344" behindDoc="0" locked="0" layoutInCell="1" allowOverlap="1" wp14:anchorId="0B1CE7B8" wp14:editId="1582FF4B">
+                <wp:simplePos x="0" y="0"/>
+                <wp:positionH relativeFrom="column">
+                  <wp:posOffset>2314575</wp:posOffset>
+                </wp:positionH>
+                <wp:positionV relativeFrom="paragraph">
+                  <wp:posOffset>640715</wp:posOffset>
+                </wp:positionV>
+                <wp:extent cx="447675" cy="104775"/>
+                <wp:effectExtent l="38100" t="0" r="28575" b="85725"/>
+                <wp:wrapNone/>
+                <wp:docPr id="203" name="Conector de Seta Reta 203"/>
+                <wp:cNvGraphicFramePr/>
+                <a:graphic xmlns:a="http://schemas.openxmlformats.org/drawingml/2006/main">
+                  <a:graphicData uri="http://schemas.microsoft.com/office/word/2010/wordprocessingShape">
+                    <wps:wsp>
+                      <wps:cNvCnPr/>
+                      <wps:spPr>
+                        <a:xfrm flipH="1">
+                          <a:off x="0" y="0"/>
+                          <a:ext cx="447675" cy="104775"/>
+                        </a:xfrm>
+                        <a:prstGeom prst="straightConnector1">
+                          <a:avLst/>
+                        </a:prstGeom>
+                        <a:ln>
+                          <a:tailEnd type="triangle"/>
+                        </a:ln>
+                      </wps:spPr>
+                      <wps:style>
+                        <a:lnRef idx="1">
+                          <a:schemeClr val="accent1"/>
+                        </a:lnRef>
+                        <a:fillRef idx="0">
+                          <a:schemeClr val="accent1"/>
+                        </a:fillRef>
+                        <a:effectRef idx="0">
+                          <a:schemeClr val="accent1"/>
+                        </a:effectRef>
+                        <a:fontRef idx="minor">
+                          <a:schemeClr val="tx1"/>
+                        </a:fontRef>
+                      </wps:style>
+                      <wps:bodyPr/>
+                    </wps:wsp>
+                  </a:graphicData>
+                </a:graphic>
+              </wp:anchor>
+            </w:drawing>
+          </mc:Choice>
+          <mc:Fallback>
+            <w:pict>
+              <v:shape w14:anchorId="3BE160CB" id="Conector de Seta Reta 203" o:spid="_x0000_s1026" type="#_x0000_t32" style="position:absolute;margin-left:182.25pt;margin-top:50.45pt;width:35.25pt;height:8.25pt;flip:x;z-index:251705344;visibility:visible;mso-wrap-style:square;mso-wrap-distance-left:9pt;mso-wrap-distance-top:0;mso-wrap-distance-right:9pt;mso-wrap-distance-bottom:0;mso-position-horizontal:absolute;mso-position-horizontal-relative:text;mso-position-vertical:absolute;mso-position-vertical-relative:text" o:gfxdata="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" strokecolor="#4472c4 [3204]" strokeweight=".5pt">
+                <v:stroke endarrow="block" joinstyle="miter"/>
+              </v:shape>
+            </w:pict>
+          </mc:Fallback>
+        </mc:AlternateContent>
+      </w:r>
+      <w:r>
+        <w:rPr>
+          <w:noProof/>
+        </w:rPr>
+        <w:drawing>
+          <wp:inline distT="0" distB="0" distL="0" distR="0" wp14:anchorId="24AA3277" wp14:editId="305ED2B4">
+            <wp:extent cx="1924319" cy="1495634"/>
+            <wp:effectExtent l="0" t="0" r="0" b="9525"/>
+            <wp:docPr id="202" name="Imagem 202"/>
+            <wp:cNvGraphicFramePr>
+              <a:graphicFrameLocks xmlns:a="http://schemas.openxmlformats.org/drawingml/2006/main" noChangeAspect="1"/>
+            </wp:cNvGraphicFramePr>
+            <a:graphic xmlns:a="http://schemas.openxmlformats.org/drawingml/2006/main">
+              <a:graphicData uri="http://schemas.openxmlformats.org/drawingml/2006/picture">
+                <pic:pic xmlns:pic="http://schemas.openxmlformats.org/drawingml/2006/picture">
+                  <pic:nvPicPr>
+                    <pic:cNvPr id="1" name=""/>
+                    <pic:cNvPicPr/>
+                  </pic:nvPicPr>
+                  <pic:blipFill>
+                    <a:blip r:embed="rId169"/>
+                    <a:stretch>
+                      <a:fillRect/>
+                    </a:stretch>
+                  </pic:blipFill>
+                  <pic:spPr>
+                    <a:xfrm>
+                      <a:off x="0" y="0"/>
+                      <a:ext cx="1924319" cy="1495634"/>
+                    </a:xfrm>
+                    <a:prstGeom prst="rect">
+                      <a:avLst/>
+                    </a:prstGeom>
+                  </pic:spPr>
+                </pic:pic>
+              </a:graphicData>
+            </a:graphic>
+          </wp:inline>
+        </w:drawing>
+      </w:r>
+      <w:r>
+        <w:rPr>
+          <w:noProof/>
+        </w:rPr>
+        <w:drawing>
+          <wp:inline distT="0" distB="0" distL="0" distR="0" wp14:anchorId="5AA971EE" wp14:editId="41196FDA">
+            <wp:extent cx="3590925" cy="1647825"/>
+            <wp:effectExtent l="0" t="0" r="9525" b="9525"/>
+            <wp:docPr id="205" name="Imagem 205"/>
+            <wp:cNvGraphicFramePr>
+              <a:graphicFrameLocks xmlns:a="http://schemas.openxmlformats.org/drawingml/2006/main" noChangeAspect="1"/>
+            </wp:cNvGraphicFramePr>
+            <a:graphic xmlns:a="http://schemas.openxmlformats.org/drawingml/2006/main">
+              <a:graphicData uri="http://schemas.openxmlformats.org/drawingml/2006/picture">
+                <pic:pic xmlns:pic="http://schemas.openxmlformats.org/drawingml/2006/picture">
+                  <pic:nvPicPr>
+                    <pic:cNvPr id="1" name=""/>
+                    <pic:cNvPicPr/>
+                  </pic:nvPicPr>
+                  <pic:blipFill>
+                    <a:blip r:embed="rId170"/>
+                    <a:stretch>
+                      <a:fillRect/>
+                    </a:stretch>
+                  </pic:blipFill>
+                  <pic:spPr>
+                    <a:xfrm>
+                      <a:off x="0" y="0"/>
+                      <a:ext cx="3591450" cy="1648066"/>
+                    </a:xfrm>
+                    <a:prstGeom prst="rect">
+                      <a:avLst/>
+                    </a:prstGeom>
+                  </pic:spPr>
+                </pic:pic>
+              </a:graphicData>
+            </a:graphic>
+          </wp:inline>
+        </w:drawing>
+      </w:r>
+    </w:p>
+    <w:p>
+      <w:pPr>
+        <w:pStyle w:val="PargrafodaLista"/>
+        <w:rPr>
+          <w:noProof/>
+        </w:rPr>
+      </w:pPr>
+      <w:r>
+        <w:rPr>
+          <w:noProof/>
+        </w:rPr>
+        <w:t xml:space="preserve">106- </w:t>
+      </w:r>
+      <w:r>
+        <w:rPr>
+          <w:noProof/>
+        </w:rPr>
+        <w:t>Na lista queremos o primeiro iten ficasse em encorpado e negrito para isso utilizamos o first-child que significa o primeiro filho conforme o código a baixo.</w:t>
+      </w:r>
+    </w:p>
+    <w:p>
+      <w:pPr>
+        <w:pStyle w:val="PargrafodaLista"/>
+        <w:rPr>
+          <w:noProof/>
+        </w:rPr>
+      </w:pPr>
+      <w:r>
+        <w:rPr>
+          <w:noProof/>
+        </w:rPr>
+        <w:drawing>
+          <wp:inline distT="0" distB="0" distL="0" distR="0" wp14:anchorId="346F5380" wp14:editId="2DE3260D">
+            <wp:extent cx="1790950" cy="933580"/>
+            <wp:effectExtent l="0" t="0" r="0" b="0"/>
+            <wp:docPr id="206" name="Imagem 206"/>
+            <wp:cNvGraphicFramePr>
+              <a:graphicFrameLocks xmlns:a="http://schemas.openxmlformats.org/drawingml/2006/main" noChangeAspect="1"/>
+            </wp:cNvGraphicFramePr>
+            <a:graphic xmlns:a="http://schemas.openxmlformats.org/drawingml/2006/main">
+              <a:graphicData uri="http://schemas.openxmlformats.org/drawingml/2006/picture">
+                <pic:pic xmlns:pic="http://schemas.openxmlformats.org/drawingml/2006/picture">
+                  <pic:nvPicPr>
+                    <pic:cNvPr id="1" name=""/>
+                    <pic:cNvPicPr/>
+                  </pic:nvPicPr>
+                  <pic:blipFill>
+                    <a:blip r:embed="rId171"/>
+                    <a:stretch>
+                      <a:fillRect/>
+                    </a:stretch>
+                  </pic:blipFill>
+                  <pic:spPr>
+                    <a:xfrm>
+                      <a:off x="0" y="0"/>
+                      <a:ext cx="1790950" cy="933580"/>
+                    </a:xfrm>
+                    <a:prstGeom prst="rect">
+                      <a:avLst/>
+                    </a:prstGeom>
+                  </pic:spPr>
+                </pic:pic>
+              </a:graphicData>
+            </a:graphic>
+          </wp:inline>
+        </w:drawing>
+      </w:r>
+      <w:r>
+        <w:rPr>
+          <w:noProof/>
+        </w:rPr>
+        <w:drawing>
+          <wp:inline distT="0" distB="0" distL="0" distR="0" wp14:anchorId="7FC2CF5B" wp14:editId="6A3AAD3E">
+            <wp:extent cx="1771650" cy="952500"/>
+            <wp:effectExtent l="0" t="0" r="0" b="0"/>
+            <wp:docPr id="207" name="Imagem 207"/>
+            <wp:cNvGraphicFramePr>
+              <a:graphicFrameLocks xmlns:a="http://schemas.openxmlformats.org/drawingml/2006/main" noChangeAspect="1"/>
+            </wp:cNvGraphicFramePr>
+            <a:graphic xmlns:a="http://schemas.openxmlformats.org/drawingml/2006/main">
+              <a:graphicData uri="http://schemas.openxmlformats.org/drawingml/2006/picture">
+                <pic:pic xmlns:pic="http://schemas.openxmlformats.org/drawingml/2006/picture">
+                  <pic:nvPicPr>
+                    <pic:cNvPr id="1" name=""/>
+                    <pic:cNvPicPr/>
+                  </pic:nvPicPr>
+                  <pic:blipFill>
+                    <a:blip r:embed="rId172"/>
+                    <a:stretch>
+                      <a:fillRect/>
+                    </a:stretch>
+                  </pic:blipFill>
+                  <pic:spPr>
+                    <a:xfrm>
+                      <a:off x="0" y="0"/>
+                      <a:ext cx="1771904" cy="952637"/>
+                    </a:xfrm>
+                    <a:prstGeom prst="rect">
+                      <a:avLst/>
+                    </a:prstGeom>
+                  </pic:spPr>
+                </pic:pic>
+              </a:graphicData>
+            </a:graphic>
+          </wp:inline>
+        </w:drawing>
+      </w:r>
+    </w:p>
+    <w:p>
+      <w:pPr>
+        <w:pStyle w:val="PargrafodaLista"/>
+        <w:rPr>
+          <w:noProof/>
+        </w:rPr>
+      </w:pPr>
+      <w:r>
+        <w:rPr>
+          <w:noProof/>
+        </w:rPr>
+        <w:t>107-</w:t>
+      </w:r>
+      <w:r>
+        <w:rPr>
+          <w:noProof/>
+        </w:rPr>
+        <w:t xml:space="preserve"> </w:t>
+      </w:r>
+      <w:r>
+        <w:rPr>
+          <w:noProof/>
+        </w:rPr>
+        <w:t>Adicionamos icones de estrela da nossa lista beneficios:</w:t>
+      </w:r>
+    </w:p>
+    <w:p>
+      <w:pPr>
+        <w:pStyle w:val="PargrafodaLista"/>
+        <w:rPr>
+          <w:noProof/>
+        </w:rPr>
+      </w:pPr>
+      <w:r>
+        <w:rPr>
+          <w:noProof/>
+        </w:rPr>
+        <w:t>Acessamos o site que contenho o icone de estrela negra</w:t>
+      </w:r>
+    </w:p>
+    <w:p>
+      <w:pPr>
+        <w:pStyle w:val="PargrafodaLista"/>
+        <w:rPr>
+          <w:noProof/>
+        </w:rPr>
+      </w:pPr>
+      <w:hyperlink r:id="rId173" w:history="1">
+        <w:r>
+          <w:rPr>
+            <w:rStyle w:val="Hyperlink"/>
+            <w:noProof/>
+          </w:rPr>
+          <w:t>https://www.compart.com/en/unicode/U+2605</w:t>
+        </w:r>
+      </w:hyperlink>
+    </w:p>
+    <w:p>
+      <w:pPr>
+        <w:pStyle w:val="PargrafodaLista"/>
+        <w:rPr>
+          <w:noProof/>
+        </w:rPr>
+      </w:pPr>
+      <w:r>
+        <w:rPr>
+          <w:noProof/>
+        </w:rPr>
+        <w:t>Copiamos o simbolo e colocamos em nosso código conforme imagem a baixo.</w:t>
+      </w:r>
+    </w:p>
+    <w:p>
+      <w:pPr>
+        <w:pStyle w:val="PargrafodaLista"/>
+        <w:rPr>
+          <w:noProof/>
+        </w:rPr>
+      </w:pPr>
+      <w:r>
+        <w:rPr>
+          <w:noProof/>
+        </w:rPr>
+        <w:drawing>
+          <wp:inline distT="0" distB="0" distL="0" distR="0" wp14:anchorId="67496E28" wp14:editId="0713E30E">
+            <wp:extent cx="1438476" cy="685896"/>
+            <wp:effectExtent l="0" t="0" r="9525" b="0"/>
+            <wp:docPr id="208" name="Imagem 208"/>
+            <wp:cNvGraphicFramePr>
+              <a:graphicFrameLocks xmlns:a="http://schemas.openxmlformats.org/drawingml/2006/main" noChangeAspect="1"/>
+            </wp:cNvGraphicFramePr>
+            <a:graphic xmlns:a="http://schemas.openxmlformats.org/drawingml/2006/main">
+              <a:graphicData uri="http://schemas.openxmlformats.org/drawingml/2006/picture">
+                <pic:pic xmlns:pic="http://schemas.openxmlformats.org/drawingml/2006/picture">
+                  <pic:nvPicPr>
+                    <pic:cNvPr id="1" name=""/>
+                    <pic:cNvPicPr/>
+                  </pic:nvPicPr>
+                  <pic:blipFill>
+                    <a:blip r:embed="rId174"/>
+                    <a:stretch>
+                      <a:fillRect/>
+                    </a:stretch>
+                  </pic:blipFill>
+                  <pic:spPr>
+                    <a:xfrm>
+                      <a:off x="0" y="0"/>
+                      <a:ext cx="1438476" cy="685896"/>
+                    </a:xfrm>
+                    <a:prstGeom prst="rect">
+                      <a:avLst/>
+                    </a:prstGeom>
+                  </pic:spPr>
+                </pic:pic>
+              </a:graphicData>
+            </a:graphic>
+          </wp:inline>
+        </w:drawing>
+      </w:r>
+      <w:r>
+        <w:rPr>
+          <w:noProof/>
+        </w:rPr>
+        <w:drawing>
+          <wp:inline distT="0" distB="0" distL="0" distR="0" wp14:anchorId="2BFA11FD" wp14:editId="434C9045">
+            <wp:extent cx="1504950" cy="647700"/>
+            <wp:effectExtent l="0" t="0" r="0" b="0"/>
+            <wp:docPr id="209" name="Imagem 209"/>
+            <wp:cNvGraphicFramePr>
+              <a:graphicFrameLocks xmlns:a="http://schemas.openxmlformats.org/drawingml/2006/main" noChangeAspect="1"/>
+            </wp:cNvGraphicFramePr>
+            <a:graphic xmlns:a="http://schemas.openxmlformats.org/drawingml/2006/main">
+              <a:graphicData uri="http://schemas.openxmlformats.org/drawingml/2006/picture">
+                <pic:pic xmlns:pic="http://schemas.openxmlformats.org/drawingml/2006/picture">
+                  <pic:nvPicPr>
+                    <pic:cNvPr id="1" name=""/>
+                    <pic:cNvPicPr/>
+                  </pic:nvPicPr>
+                  <pic:blipFill>
+                    <a:blip r:embed="rId175"/>
+                    <a:stretch>
+                      <a:fillRect/>
+                    </a:stretch>
+                  </pic:blipFill>
+                  <pic:spPr>
+                    <a:xfrm>
+                      <a:off x="0" y="0"/>
+                      <a:ext cx="1505164" cy="647792"/>
+                    </a:xfrm>
+                    <a:prstGeom prst="rect">
+                      <a:avLst/>
+                    </a:prstGeom>
+                  </pic:spPr>
+                </pic:pic>
+              </a:graphicData>
+            </a:graphic>
+          </wp:inline>
+        </w:drawing>
+      </w:r>
+    </w:p>
+    <w:p>
+      <w:pPr>
+        <w:pStyle w:val="PargrafodaLista"/>
+        <w:rPr>
+          <w:noProof/>
+        </w:rPr>
+      </w:pPr>
+      <w:r>
+        <w:rPr>
+          <w:noProof/>
+        </w:rPr>
+        <w:t>108- Aumentamos o espaço interno da seção beneficios para cima e para baixo.</w:t>
+      </w:r>
+    </w:p>
+    <w:p>
+      <w:pPr>
+        <w:pStyle w:val="PargrafodaLista"/>
+        <w:rPr>
+          <w:noProof/>
+        </w:rPr>
+      </w:pPr>
+      <w:r>
+        <w:rPr>
+          <w:noProof/>
+        </w:rPr>
+        <w:drawing>
+          <wp:inline distT="0" distB="0" distL="0" distR="0" wp14:anchorId="45FD9F83" wp14:editId="2DDD33B7">
+            <wp:extent cx="1552792" cy="514422"/>
+            <wp:effectExtent l="0" t="0" r="9525" b="0"/>
+            <wp:docPr id="210" name="Imagem 210"/>
+            <wp:cNvGraphicFramePr>
+              <a:graphicFrameLocks xmlns:a="http://schemas.openxmlformats.org/drawingml/2006/main" noChangeAspect="1"/>
+            </wp:cNvGraphicFramePr>
+            <a:graphic xmlns:a="http://schemas.openxmlformats.org/drawingml/2006/main">
+              <a:graphicData uri="http://schemas.openxmlformats.org/drawingml/2006/picture">
+                <pic:pic xmlns:pic="http://schemas.openxmlformats.org/drawingml/2006/picture">
+                  <pic:nvPicPr>
+                    <pic:cNvPr id="1" name=""/>
+                    <pic:cNvPicPr/>
+                  </pic:nvPicPr>
+                  <pic:blipFill>
+                    <a:blip r:embed="rId176"/>
+                    <a:stretch>
+                      <a:fillRect/>
+                    </a:stretch>
+                  </pic:blipFill>
+                  <pic:spPr>
+                    <a:xfrm>
+                      <a:off x="0" y="0"/>
+                      <a:ext cx="1552792" cy="514422"/>
+                    </a:xfrm>
+                    <a:prstGeom prst="rect">
+                      <a:avLst/>
+                    </a:prstGeom>
+                  </pic:spPr>
+                </pic:pic>
+              </a:graphicData>
+            </a:graphic>
+          </wp:inline>
+        </w:drawing>
+      </w:r>
+    </w:p>
+    <w:p>
+      <w:pPr>
+        <w:pStyle w:val="PargrafodaLista"/>
+        <w:rPr>
+          <w:noProof/>
+        </w:rPr>
+      </w:pPr>
+      <w:r>
+        <w:rPr>
+          <w:noProof/>
+        </w:rPr>
+        <w:t>109- Na div contem a lista e a imagem beneficios demos uma largura e centralizamos o item (a lista e a imagem) conforme código.</w:t>
+      </w:r>
+    </w:p>
+    <w:p>
+      <w:pPr>
+        <w:pStyle w:val="PargrafodaLista"/>
+        <w:rPr>
+          <w:noProof/>
+        </w:rPr>
+      </w:pPr>
+      <w:r>
+        <w:rPr>
+          <w:noProof/>
+        </w:rPr>
+        <w:drawing>
+          <wp:inline distT="0" distB="0" distL="0" distR="0" wp14:anchorId="3A0BF4F0" wp14:editId="7174D61E">
+            <wp:extent cx="1504950" cy="733425"/>
+            <wp:effectExtent l="0" t="0" r="0" b="9525"/>
+            <wp:docPr id="211" name="Imagem 211"/>
+            <wp:cNvGraphicFramePr>
+              <a:graphicFrameLocks xmlns:a="http://schemas.openxmlformats.org/drawingml/2006/main" noChangeAspect="1"/>
+            </wp:cNvGraphicFramePr>
+            <a:graphic xmlns:a="http://schemas.openxmlformats.org/drawingml/2006/main">
+              <a:graphicData uri="http://schemas.openxmlformats.org/drawingml/2006/picture">
+                <pic:pic xmlns:pic="http://schemas.openxmlformats.org/drawingml/2006/picture">
+                  <pic:nvPicPr>
+                    <pic:cNvPr id="1" name=""/>
+                    <pic:cNvPicPr/>
+                  </pic:nvPicPr>
+                  <pic:blipFill>
+                    <a:blip r:embed="rId177"/>
+                    <a:stretch>
+                      <a:fillRect/>
+                    </a:stretch>
+                  </pic:blipFill>
+                  <pic:spPr>
+                    <a:xfrm>
+                      <a:off x="0" y="0"/>
+                      <a:ext cx="1505165" cy="733530"/>
+                    </a:xfrm>
+                    <a:prstGeom prst="rect">
+                      <a:avLst/>
+                    </a:prstGeom>
+                  </pic:spPr>
+                </pic:pic>
+              </a:graphicData>
+            </a:graphic>
+          </wp:inline>
+        </w:drawing>
+      </w:r>
+    </w:p>
+    <w:p>
+      <w:pPr>
+        <w:pStyle w:val="PargrafodaLista"/>
+        <w:rPr>
+          <w:noProof/>
+        </w:rPr>
+      </w:pPr>
+      <w:r>
+        <w:rPr>
+          <w:noProof/>
+        </w:rPr>
+        <w:t>110-</w:t>
+      </w:r>
       <w:bookmarkStart w:id="0" w:name="_GoBack"/>
       <w:bookmarkEnd w:id="0"/>
-    </w:p>
-    <w:p>
-      <w:pPr>
-        <w:rPr>
-          <w:noProof/>
-        </w:rPr>
-      </w:pPr>
     </w:p>
     <w:sectPr>
       <w:pgSz w:w="11906" w:h="16838"/>
@@ -14882,7 +15747,7 @@
 </file>
 
 <file path=customXml/itemProps4.xml><?xml version="1.0" encoding="utf-8"?>
-<ds:datastoreItem xmlns:ds="http://schemas.openxmlformats.org/officeDocument/2006/customXml" ds:itemID="{4384A96B-6D37-4F6E-B9F6-56B7E2DE3168}">
+<ds:datastoreItem xmlns:ds="http://schemas.openxmlformats.org/officeDocument/2006/customXml" ds:itemID="{1191458A-60D0-4A84-B30B-F0633BBE8B44}">
   <ds:schemaRefs>
     <ds:schemaRef ds:uri="http://schemas.openxmlformats.org/officeDocument/2006/bibliography"/>
   </ds:schemaRefs>

</xml_diff>

<commit_message>
atualização da aula 05/10/2026
</commit_message>
<xml_diff>
--- a/apostila/Projeto Space for me3 (Recuperação Automática).docx
+++ b/apostila/Projeto Space for me3 (Recuperação Automática).docx
@@ -13462,31 +13462,12 @@
           <w:noProof/>
         </w:rPr>
       </w:pPr>
-    </w:p>
-    <w:p>
-      <w:pPr>
-        <w:rPr>
-          <w:noProof/>
-        </w:rPr>
-      </w:pPr>
-      <w:r>
-        <w:rPr>
-          <w:noProof/>
-        </w:rPr>
-        <w:t>104-</w:t>
-      </w:r>
-      <w:r>
-        <w:rPr>
-          <w:noProof/>
-        </w:rPr>
-        <w:t xml:space="preserve"> Após colocar</w:t>
-      </w:r>
-      <w:r>
-        <w:rPr>
-          <w:noProof/>
-        </w:rPr>
-        <w:drawing>
-          <wp:inline distT="0" distB="0" distL="0" distR="0" wp14:anchorId="21ACF518" wp14:editId="034354C4">
+      <w:r>
+        <w:rPr>
+          <w:noProof/>
+        </w:rPr>
+        <w:drawing>
+          <wp:inline distT="0" distB="0" distL="0" distR="0" wp14:anchorId="303FA403" wp14:editId="1483CCED">
             <wp:extent cx="3000375" cy="1343025"/>
             <wp:effectExtent l="0" t="0" r="9525" b="9525"/>
             <wp:docPr id="199" name="Imagem 199"/>
@@ -13520,6 +13501,31 @@
             </a:graphic>
           </wp:inline>
         </w:drawing>
+      </w:r>
+    </w:p>
+    <w:p>
+      <w:pPr>
+        <w:rPr>
+          <w:noProof/>
+        </w:rPr>
+      </w:pPr>
+      <w:r>
+        <w:rPr>
+          <w:noProof/>
+        </w:rPr>
+        <w:t>104-</w:t>
+      </w:r>
+      <w:r>
+        <w:rPr>
+          <w:noProof/>
+        </w:rPr>
+        <w:t xml:space="preserve"> Após ca</w:t>
+      </w:r>
+      <w:r>
+        <w:rPr>
+          <w:noProof/>
+        </w:rPr>
+        <w:t>locar</w:t>
       </w:r>
       <w:r>
         <w:rPr>
@@ -13566,7 +13572,6 @@
     </w:p>
     <w:p>
       <w:pPr>
-        <w:pStyle w:val="PargrafodaLista"/>
         <w:rPr>
           <w:noProof/>
         </w:rPr>
@@ -13580,7 +13585,6 @@
     </w:p>
     <w:p>
       <w:pPr>
-        <w:pStyle w:val="PargrafodaLista"/>
         <w:rPr>
           <w:noProof/>
         </w:rPr>
@@ -13668,7 +13672,6 @@
     </w:p>
     <w:p>
       <w:pPr>
-        <w:pStyle w:val="PargrafodaLista"/>
         <w:rPr>
           <w:noProof/>
         </w:rPr>
@@ -13688,7 +13691,6 @@
     </w:p>
     <w:p>
       <w:pPr>
-        <w:pStyle w:val="PargrafodaLista"/>
         <w:rPr>
           <w:noProof/>
         </w:rPr>
@@ -13912,7 +13914,6 @@
     </w:p>
     <w:p>
       <w:pPr>
-        <w:pStyle w:val="PargrafodaLista"/>
         <w:rPr>
           <w:noProof/>
         </w:rPr>
@@ -13932,7 +13933,6 @@
     </w:p>
     <w:p>
       <w:pPr>
-        <w:pStyle w:val="PargrafodaLista"/>
         <w:rPr>
           <w:noProof/>
         </w:rPr>
@@ -14020,7 +14020,6 @@
     </w:p>
     <w:p>
       <w:pPr>
-        <w:pStyle w:val="PargrafodaLista"/>
         <w:rPr>
           <w:noProof/>
         </w:rPr>
@@ -14046,7 +14045,6 @@
     </w:p>
     <w:p>
       <w:pPr>
-        <w:pStyle w:val="PargrafodaLista"/>
         <w:rPr>
           <w:noProof/>
         </w:rPr>
@@ -14060,7 +14058,6 @@
     </w:p>
     <w:p>
       <w:pPr>
-        <w:pStyle w:val="PargrafodaLista"/>
         <w:rPr>
           <w:noProof/>
         </w:rPr>
@@ -14077,7 +14074,6 @@
     </w:p>
     <w:p>
       <w:pPr>
-        <w:pStyle w:val="PargrafodaLista"/>
         <w:rPr>
           <w:noProof/>
         </w:rPr>
@@ -14091,7 +14087,6 @@
     </w:p>
     <w:p>
       <w:pPr>
-        <w:pStyle w:val="PargrafodaLista"/>
         <w:rPr>
           <w:noProof/>
         </w:rPr>
@@ -14179,7 +14174,6 @@
     </w:p>
     <w:p>
       <w:pPr>
-        <w:pStyle w:val="PargrafodaLista"/>
         <w:rPr>
           <w:noProof/>
         </w:rPr>
@@ -14193,7 +14187,6 @@
     </w:p>
     <w:p>
       <w:pPr>
-        <w:pStyle w:val="PargrafodaLista"/>
         <w:rPr>
           <w:noProof/>
         </w:rPr>
@@ -14241,7 +14234,6 @@
     </w:p>
     <w:p>
       <w:pPr>
-        <w:pStyle w:val="PargrafodaLista"/>
         <w:rPr>
           <w:noProof/>
         </w:rPr>
@@ -14255,7 +14247,6 @@
     </w:p>
     <w:p>
       <w:pPr>
-        <w:pStyle w:val="PargrafodaLista"/>
         <w:rPr>
           <w:noProof/>
         </w:rPr>
@@ -14303,16 +14294,528 @@
     </w:p>
     <w:p>
       <w:pPr>
+        <w:rPr>
+          <w:noProof/>
+        </w:rPr>
+      </w:pPr>
+      <w:r>
+        <w:rPr>
+          <w:noProof/>
+        </w:rPr>
+        <w:t>110-</w:t>
+      </w:r>
+      <w:r>
+        <w:rPr>
+          <w:noProof/>
+        </w:rPr>
+        <w:t xml:space="preserve"> Aumentamos o espaço interno da section principal e adicionamos uma cor de fundo para fazer um degrade ou seja é área onde duas ou mais cores são sobrepostas.</w:t>
+      </w:r>
+    </w:p>
+    <w:p>
+      <w:pPr>
+        <w:rPr>
+          <w:noProof/>
+        </w:rPr>
+      </w:pPr>
+      <w:r>
+        <w:rPr>
+          <w:noProof/>
+        </w:rPr>
+        <w:drawing>
+          <wp:inline distT="0" distB="0" distL="0" distR="0" wp14:anchorId="57F46D74" wp14:editId="5717E550">
+            <wp:extent cx="2734057" cy="809738"/>
+            <wp:effectExtent l="0" t="0" r="9525" b="9525"/>
+            <wp:docPr id="212" name="Imagem 212"/>
+            <wp:cNvGraphicFramePr>
+              <a:graphicFrameLocks xmlns:a="http://schemas.openxmlformats.org/drawingml/2006/main" noChangeAspect="1"/>
+            </wp:cNvGraphicFramePr>
+            <a:graphic xmlns:a="http://schemas.openxmlformats.org/drawingml/2006/main">
+              <a:graphicData uri="http://schemas.openxmlformats.org/drawingml/2006/picture">
+                <pic:pic xmlns:pic="http://schemas.openxmlformats.org/drawingml/2006/picture">
+                  <pic:nvPicPr>
+                    <pic:cNvPr id="1" name=""/>
+                    <pic:cNvPicPr/>
+                  </pic:nvPicPr>
+                  <pic:blipFill>
+                    <a:blip r:embed="rId178"/>
+                    <a:stretch>
+                      <a:fillRect/>
+                    </a:stretch>
+                  </pic:blipFill>
+                  <pic:spPr>
+                    <a:xfrm>
+                      <a:off x="0" y="0"/>
+                      <a:ext cx="2734057" cy="809738"/>
+                    </a:xfrm>
+                    <a:prstGeom prst="rect">
+                      <a:avLst/>
+                    </a:prstGeom>
+                  </pic:spPr>
+                </pic:pic>
+              </a:graphicData>
+            </a:graphic>
+          </wp:inline>
+        </w:drawing>
+      </w:r>
+    </w:p>
+    <w:p>
+      <w:pPr>
+        <w:rPr>
+          <w:noProof/>
+        </w:rPr>
+      </w:pPr>
+      <w:r>
+        <w:rPr>
+          <w:noProof/>
+        </w:rPr>
+        <w:t>111- Colocamos uma cor de fundo na section beneficios para realizar o nosso degrade.</w:t>
+      </w:r>
+    </w:p>
+    <w:p>
+      <w:pPr>
+        <w:rPr>
+          <w:noProof/>
+        </w:rPr>
+      </w:pPr>
+      <w:r>
+        <w:rPr>
+          <w:noProof/>
+        </w:rPr>
+        <w:drawing>
+          <wp:inline distT="0" distB="0" distL="0" distR="0" wp14:anchorId="0D3AA8B5" wp14:editId="1E66DADB">
+            <wp:extent cx="2305372" cy="733527"/>
+            <wp:effectExtent l="0" t="0" r="0" b="9525"/>
+            <wp:docPr id="213" name="Imagem 213"/>
+            <wp:cNvGraphicFramePr>
+              <a:graphicFrameLocks xmlns:a="http://schemas.openxmlformats.org/drawingml/2006/main" noChangeAspect="1"/>
+            </wp:cNvGraphicFramePr>
+            <a:graphic xmlns:a="http://schemas.openxmlformats.org/drawingml/2006/main">
+              <a:graphicData uri="http://schemas.openxmlformats.org/drawingml/2006/picture">
+                <pic:pic xmlns:pic="http://schemas.openxmlformats.org/drawingml/2006/picture">
+                  <pic:nvPicPr>
+                    <pic:cNvPr id="1" name=""/>
+                    <pic:cNvPicPr/>
+                  </pic:nvPicPr>
+                  <pic:blipFill>
+                    <a:blip r:embed="rId179"/>
+                    <a:stretch>
+                      <a:fillRect/>
+                    </a:stretch>
+                  </pic:blipFill>
+                  <pic:spPr>
+                    <a:xfrm>
+                      <a:off x="0" y="0"/>
+                      <a:ext cx="2305372" cy="733527"/>
+                    </a:xfrm>
+                    <a:prstGeom prst="rect">
+                      <a:avLst/>
+                    </a:prstGeom>
+                  </pic:spPr>
+                </pic:pic>
+              </a:graphicData>
+            </a:graphic>
+          </wp:inline>
+        </w:drawing>
+      </w:r>
+    </w:p>
+    <w:p>
+      <w:pPr>
+        <w:rPr>
+          <w:noProof/>
+        </w:rPr>
+      </w:pPr>
+      <w:r>
+        <w:rPr>
+          <w:noProof/>
+        </w:rPr>
+        <w:t>112-</w:t>
+      </w:r>
+      <w:r>
+        <w:rPr>
+          <w:noProof/>
+        </w:rPr>
+        <w:t xml:space="preserve"> </w:t>
+      </w:r>
+      <w:r>
+        <w:rPr>
+          <w:noProof/>
+        </w:rPr>
+        <w:t>Para fazer o degrade tiramos o main que estava configurando para a largura de 940px e centralizamos o elemento em  margin:0 auto, com ao colocar a cor de fundo nas section que estava dentro do main as cores ficavam centralizados.Para resolver  colocamos o margin 0 auto e width 940px no section principal e section mapa e na section beneficios.</w:t>
+      </w:r>
+    </w:p>
+    <w:p>
+      <w:pPr>
         <w:pStyle w:val="PargrafodaLista"/>
         <w:rPr>
           <w:noProof/>
         </w:rPr>
       </w:pPr>
-      <w:r>
-        <w:rPr>
-          <w:noProof/>
-        </w:rPr>
-        <w:t>110-</w:t>
+    </w:p>
+    <w:p>
+      <w:pPr>
+        <w:rPr>
+          <w:noProof/>
+        </w:rPr>
+      </w:pPr>
+      <w:r>
+        <w:rPr>
+          <w:noProof/>
+        </w:rPr>
+        <w:t xml:space="preserve">Ao fazer também percebemos que o mapa não ficou centralizado para isso criamos uma div que envolve o mapa chamada mapa-conteudo e colocamos que também colocamos o width 940px e margin </w:t>
+      </w:r>
+      <w:r>
+        <w:rPr>
+          <w:noProof/>
+        </w:rPr>
+        <w:t>0auto.</w:t>
+      </w:r>
+    </w:p>
+    <w:p>
+      <w:pPr>
+        <w:rPr>
+          <w:noProof/>
+        </w:rPr>
+      </w:pPr>
+      <w:r>
+        <w:rPr>
+          <w:noProof/>
+        </w:rPr>
+        <w:t>Na class .mapa colocamos o degrade para fazer essas cores sobrepostas porque o mapa esta a section principal e a beneficios onde queriamos fazer o degrade.</w:t>
+      </w:r>
+    </w:p>
+    <w:p>
+      <w:pPr>
+        <w:rPr>
+          <w:noProof/>
+        </w:rPr>
+      </w:pPr>
+      <w:r>
+        <w:rPr>
+          <w:noProof/>
+        </w:rPr>
+        <w:drawing>
+          <wp:inline distT="0" distB="0" distL="0" distR="0" wp14:anchorId="0CA05E94" wp14:editId="7F591759">
+            <wp:extent cx="2457450" cy="1000125"/>
+            <wp:effectExtent l="0" t="0" r="0" b="9525"/>
+            <wp:docPr id="214" name="Imagem 214"/>
+            <wp:cNvGraphicFramePr>
+              <a:graphicFrameLocks xmlns:a="http://schemas.openxmlformats.org/drawingml/2006/main" noChangeAspect="1"/>
+            </wp:cNvGraphicFramePr>
+            <a:graphic xmlns:a="http://schemas.openxmlformats.org/drawingml/2006/main">
+              <a:graphicData uri="http://schemas.openxmlformats.org/drawingml/2006/picture">
+                <pic:pic xmlns:pic="http://schemas.openxmlformats.org/drawingml/2006/picture">
+                  <pic:nvPicPr>
+                    <pic:cNvPr id="1" name=""/>
+                    <pic:cNvPicPr/>
+                  </pic:nvPicPr>
+                  <pic:blipFill>
+                    <a:blip r:embed="rId180"/>
+                    <a:stretch>
+                      <a:fillRect/>
+                    </a:stretch>
+                  </pic:blipFill>
+                  <pic:spPr>
+                    <a:xfrm>
+                      <a:off x="0" y="0"/>
+                      <a:ext cx="2457811" cy="1000272"/>
+                    </a:xfrm>
+                    <a:prstGeom prst="rect">
+                      <a:avLst/>
+                    </a:prstGeom>
+                  </pic:spPr>
+                </pic:pic>
+              </a:graphicData>
+            </a:graphic>
+          </wp:inline>
+        </w:drawing>
+      </w:r>
+      <w:r>
+        <w:rPr>
+          <w:noProof/>
+        </w:rPr>
+        <w:drawing>
+          <wp:inline distT="0" distB="0" distL="0" distR="0" wp14:anchorId="71DD5A6A" wp14:editId="53E27863">
+            <wp:extent cx="4038600" cy="923925"/>
+            <wp:effectExtent l="0" t="0" r="0" b="9525"/>
+            <wp:docPr id="215" name="Imagem 215"/>
+            <wp:cNvGraphicFramePr>
+              <a:graphicFrameLocks xmlns:a="http://schemas.openxmlformats.org/drawingml/2006/main" noChangeAspect="1"/>
+            </wp:cNvGraphicFramePr>
+            <a:graphic xmlns:a="http://schemas.openxmlformats.org/drawingml/2006/main">
+              <a:graphicData uri="http://schemas.openxmlformats.org/drawingml/2006/picture">
+                <pic:pic xmlns:pic="http://schemas.openxmlformats.org/drawingml/2006/picture">
+                  <pic:nvPicPr>
+                    <pic:cNvPr id="1" name=""/>
+                    <pic:cNvPicPr/>
+                  </pic:nvPicPr>
+                  <pic:blipFill>
+                    <a:blip r:embed="rId181"/>
+                    <a:stretch>
+                      <a:fillRect/>
+                    </a:stretch>
+                  </pic:blipFill>
+                  <pic:spPr>
+                    <a:xfrm>
+                      <a:off x="0" y="0"/>
+                      <a:ext cx="4039181" cy="924058"/>
+                    </a:xfrm>
+                    <a:prstGeom prst="rect">
+                      <a:avLst/>
+                    </a:prstGeom>
+                  </pic:spPr>
+                </pic:pic>
+              </a:graphicData>
+            </a:graphic>
+          </wp:inline>
+        </w:drawing>
+      </w:r>
+    </w:p>
+    <w:p>
+      <w:pPr>
+        <w:rPr>
+          <w:rStyle w:val="nfaseSutil"/>
+        </w:rPr>
+      </w:pPr>
+      <w:r>
+        <w:rPr>
+          <w:noProof/>
+        </w:rPr>
+        <w:t>113-</w:t>
+      </w:r>
+      <w:r>
+        <w:rPr>
+          <w:noProof/>
+        </w:rPr>
+        <w:t xml:space="preserve">  Centralizamos o mapa</w:t>
+      </w:r>
+    </w:p>
+    <w:p>
+      <w:pPr>
+        <w:rPr>
+          <w:noProof/>
+        </w:rPr>
+      </w:pPr>
+      <w:r>
+        <w:rPr>
+          <w:noProof/>
+        </w:rPr>
+        <w:t>Durante os ajustes, percebemos que o mapa também não estava centralizado corretamente.</w:t>
+      </w:r>
+    </w:p>
+    <w:p>
+      <w:pPr>
+        <w:rPr>
+          <w:noProof/>
+        </w:rPr>
+      </w:pPr>
+      <w:r>
+        <w:rPr>
+          <w:noProof/>
+        </w:rPr>
+        <w:t>Para solucionar esse problema, criamos uma div chamada .mapa-conteudo, responsável por envolver o mapa:</w:t>
+      </w:r>
+      <w:r>
+        <w:rPr>
+          <w:noProof/>
+        </w:rPr>
+        <w:t xml:space="preserve"> </w:t>
+      </w:r>
+    </w:p>
+    <w:p>
+      <w:pPr>
+        <w:rPr>
+          <w:noProof/>
+        </w:rPr>
+      </w:pPr>
+      <w:r>
+        <w:rPr>
+          <w:noProof/>
+        </w:rPr>
+        <w:drawing>
+          <wp:inline distT="0" distB="0" distL="0" distR="0" wp14:anchorId="38ADBD34" wp14:editId="7C403A65">
+            <wp:extent cx="7268589" cy="1181265"/>
+            <wp:effectExtent l="0" t="0" r="0" b="0"/>
+            <wp:docPr id="217" name="Imagem 217"/>
+            <wp:cNvGraphicFramePr>
+              <a:graphicFrameLocks xmlns:a="http://schemas.openxmlformats.org/drawingml/2006/main" noChangeAspect="1"/>
+            </wp:cNvGraphicFramePr>
+            <a:graphic xmlns:a="http://schemas.openxmlformats.org/drawingml/2006/main">
+              <a:graphicData uri="http://schemas.openxmlformats.org/drawingml/2006/picture">
+                <pic:pic xmlns:pic="http://schemas.openxmlformats.org/drawingml/2006/picture">
+                  <pic:nvPicPr>
+                    <pic:cNvPr id="1" name=""/>
+                    <pic:cNvPicPr/>
+                  </pic:nvPicPr>
+                  <pic:blipFill>
+                    <a:blip r:embed="rId182"/>
+                    <a:stretch>
+                      <a:fillRect/>
+                    </a:stretch>
+                  </pic:blipFill>
+                  <pic:spPr>
+                    <a:xfrm>
+                      <a:off x="0" y="0"/>
+                      <a:ext cx="7268589" cy="1181265"/>
+                    </a:xfrm>
+                    <a:prstGeom prst="rect">
+                      <a:avLst/>
+                    </a:prstGeom>
+                  </pic:spPr>
+                </pic:pic>
+              </a:graphicData>
+            </a:graphic>
+          </wp:inline>
+        </w:drawing>
+      </w:r>
+      <w:r>
+        <w:rPr>
+          <w:noProof/>
+        </w:rPr>
+        <w:drawing>
+          <wp:inline distT="0" distB="0" distL="0" distR="0" wp14:anchorId="181AFF76" wp14:editId="5EC71B38">
+            <wp:extent cx="1705213" cy="800212"/>
+            <wp:effectExtent l="0" t="0" r="0" b="0"/>
+            <wp:docPr id="218" name="Imagem 218"/>
+            <wp:cNvGraphicFramePr>
+              <a:graphicFrameLocks xmlns:a="http://schemas.openxmlformats.org/drawingml/2006/main" noChangeAspect="1"/>
+            </wp:cNvGraphicFramePr>
+            <a:graphic xmlns:a="http://schemas.openxmlformats.org/drawingml/2006/main">
+              <a:graphicData uri="http://schemas.openxmlformats.org/drawingml/2006/picture">
+                <pic:pic xmlns:pic="http://schemas.openxmlformats.org/drawingml/2006/picture">
+                  <pic:nvPicPr>
+                    <pic:cNvPr id="1" name=""/>
+                    <pic:cNvPicPr/>
+                  </pic:nvPicPr>
+                  <pic:blipFill>
+                    <a:blip r:embed="rId183"/>
+                    <a:stretch>
+                      <a:fillRect/>
+                    </a:stretch>
+                  </pic:blipFill>
+                  <pic:spPr>
+                    <a:xfrm>
+                      <a:off x="0" y="0"/>
+                      <a:ext cx="1705213" cy="800212"/>
+                    </a:xfrm>
+                    <a:prstGeom prst="rect">
+                      <a:avLst/>
+                    </a:prstGeom>
+                  </pic:spPr>
+                </pic:pic>
+              </a:graphicData>
+            </a:graphic>
+          </wp:inline>
+        </w:drawing>
+      </w:r>
+    </w:p>
+    <w:p>
+      <w:pPr>
+        <w:pStyle w:val="SemEspaamento"/>
+        <w:rPr>
+          <w:noProof/>
+        </w:rPr>
+      </w:pPr>
+      <w:r>
+        <w:rPr>
+          <w:noProof/>
+        </w:rPr>
+        <w:t xml:space="preserve">114-  </w:t>
+      </w:r>
+      <w:r>
+        <w:rPr>
+          <w:noProof/>
+        </w:rPr>
+        <w:t>Dessa forma, o fundo da seção .</w:t>
+      </w:r>
+      <w:r>
+        <w:rPr>
+          <w:noProof/>
+        </w:rPr>
+        <w:t xml:space="preserve"> </w:t>
+      </w:r>
+      <w:r>
+        <w:rPr>
+          <w:noProof/>
+        </w:rPr>
+        <w:t>mapa pode ocupar toda a área disponivel, enquanto conteúdo do mapa permace centralizado em uma largura de 940px.</w:t>
+      </w:r>
+    </w:p>
+    <w:p>
+      <w:pPr>
+        <w:pStyle w:val="SemEspaamento"/>
+        <w:rPr>
+          <w:rStyle w:val="Forte"/>
+        </w:rPr>
+      </w:pPr>
+    </w:p>
+    <w:p>
+      <w:pPr>
+        <w:pStyle w:val="SemEspaamento"/>
+        <w:rPr>
+          <w:noProof/>
+        </w:rPr>
+      </w:pPr>
+      <w:r>
+        <w:rPr>
+          <w:noProof/>
+        </w:rPr>
+        <w:drawing>
+          <wp:inline distT="0" distB="0" distL="0" distR="0" wp14:anchorId="5D155294" wp14:editId="160DEA8F">
+            <wp:extent cx="4124901" cy="895475"/>
+            <wp:effectExtent l="0" t="0" r="9525" b="0"/>
+            <wp:docPr id="219" name="Imagem 219"/>
+            <wp:cNvGraphicFramePr>
+              <a:graphicFrameLocks xmlns:a="http://schemas.openxmlformats.org/drawingml/2006/main" noChangeAspect="1"/>
+            </wp:cNvGraphicFramePr>
+            <a:graphic xmlns:a="http://schemas.openxmlformats.org/drawingml/2006/main">
+              <a:graphicData uri="http://schemas.openxmlformats.org/drawingml/2006/picture">
+                <pic:pic xmlns:pic="http://schemas.openxmlformats.org/drawingml/2006/picture">
+                  <pic:nvPicPr>
+                    <pic:cNvPr id="1" name=""/>
+                    <pic:cNvPicPr/>
+                  </pic:nvPicPr>
+                  <pic:blipFill>
+                    <a:blip r:embed="rId184"/>
+                    <a:stretch>
+                      <a:fillRect/>
+                    </a:stretch>
+                  </pic:blipFill>
+                  <pic:spPr>
+                    <a:xfrm>
+                      <a:off x="0" y="0"/>
+                      <a:ext cx="4124901" cy="895475"/>
+                    </a:xfrm>
+                    <a:prstGeom prst="rect">
+                      <a:avLst/>
+                    </a:prstGeom>
+                  </pic:spPr>
+                </pic:pic>
+              </a:graphicData>
+            </a:graphic>
+          </wp:inline>
+        </w:drawing>
+      </w:r>
+    </w:p>
+    <w:p>
+      <w:pPr>
+        <w:pStyle w:val="SemEspaamento"/>
+        <w:rPr>
+          <w:noProof/>
+        </w:rPr>
+      </w:pPr>
+    </w:p>
+    <w:p>
+      <w:pPr>
+        <w:pStyle w:val="SemEspaamento"/>
+        <w:rPr>
+          <w:noProof/>
+        </w:rPr>
+      </w:pPr>
+      <w:r>
+        <w:rPr>
+          <w:noProof/>
+        </w:rPr>
+        <w:t>O objetivo é criar uma transição suave entre as cores das seções.Como o mapa esta localizado entre a seção principal e a seção de beneficios. O degradê cria uma transição visual entre esses diferentes fundos.</w:t>
       </w:r>
       <w:bookmarkStart w:id="0" w:name="_GoBack"/>
       <w:bookmarkEnd w:id="0"/>
@@ -15078,6 +15581,27 @@
     <w:name w:val="Normal"/>
     <w:qFormat/>
   </w:style>
+  <w:style w:type="paragraph" w:styleId="Ttulo1">
+    <w:name w:val="heading 1"/>
+    <w:basedOn w:val="Normal"/>
+    <w:next w:val="Normal"/>
+    <w:link w:val="Ttulo1Char"/>
+    <w:uiPriority w:val="9"/>
+    <w:qFormat/>
+    <w:rsid w:val="006B07DA"/>
+    <w:pPr>
+      <w:keepNext/>
+      <w:keepLines/>
+      <w:spacing w:before="240" w:after="0"/>
+      <w:outlineLvl w:val="0"/>
+    </w:pPr>
+    <w:rPr>
+      <w:rFonts w:asciiTheme="majorHAnsi" w:eastAsiaTheme="majorEastAsia" w:hAnsiTheme="majorHAnsi" w:cstheme="majorBidi"/>
+      <w:color w:val="2F5496" w:themeColor="accent1" w:themeShade="BF"/>
+      <w:sz w:val="32"/>
+      <w:szCs w:val="32"/>
+    </w:rPr>
+  </w:style>
   <w:style w:type="character" w:default="1" w:styleId="Fontepargpadro">
     <w:name w:val="Default Paragraph Font"/>
     <w:uiPriority w:val="1"/>
@@ -15149,6 +15673,85 @@
     <w:rPr>
       <w:color w:val="954F72" w:themeColor="followedHyperlink"/>
       <w:u w:val="single"/>
+    </w:rPr>
+  </w:style>
+  <w:style w:type="paragraph" w:styleId="Ttulo">
+    <w:name w:val="Title"/>
+    <w:basedOn w:val="Normal"/>
+    <w:next w:val="Normal"/>
+    <w:link w:val="TtuloChar"/>
+    <w:uiPriority w:val="10"/>
+    <w:qFormat/>
+    <w:rsid w:val="006B07DA"/>
+    <w:pPr>
+      <w:spacing w:after="0" w:line="240" w:lineRule="auto"/>
+      <w:contextualSpacing/>
+    </w:pPr>
+    <w:rPr>
+      <w:rFonts w:asciiTheme="majorHAnsi" w:eastAsiaTheme="majorEastAsia" w:hAnsiTheme="majorHAnsi" w:cstheme="majorBidi"/>
+      <w:spacing w:val="-10"/>
+      <w:kern w:val="28"/>
+      <w:sz w:val="56"/>
+      <w:szCs w:val="56"/>
+    </w:rPr>
+  </w:style>
+  <w:style w:type="character" w:customStyle="1" w:styleId="TtuloChar">
+    <w:name w:val="Título Char"/>
+    <w:basedOn w:val="Fontepargpadro"/>
+    <w:link w:val="Ttulo"/>
+    <w:uiPriority w:val="10"/>
+    <w:rsid w:val="006B07DA"/>
+    <w:rPr>
+      <w:rFonts w:asciiTheme="majorHAnsi" w:eastAsiaTheme="majorEastAsia" w:hAnsiTheme="majorHAnsi" w:cstheme="majorBidi"/>
+      <w:spacing w:val="-10"/>
+      <w:kern w:val="28"/>
+      <w:sz w:val="56"/>
+      <w:szCs w:val="56"/>
+    </w:rPr>
+  </w:style>
+  <w:style w:type="paragraph" w:styleId="SemEspaamento">
+    <w:name w:val="No Spacing"/>
+    <w:uiPriority w:val="1"/>
+    <w:qFormat/>
+    <w:rsid w:val="006B07DA"/>
+    <w:pPr>
+      <w:spacing w:after="0" w:line="240" w:lineRule="auto"/>
+    </w:pPr>
+  </w:style>
+  <w:style w:type="character" w:customStyle="1" w:styleId="Ttulo1Char">
+    <w:name w:val="Título 1 Char"/>
+    <w:basedOn w:val="Fontepargpadro"/>
+    <w:link w:val="Ttulo1"/>
+    <w:uiPriority w:val="9"/>
+    <w:rsid w:val="006B07DA"/>
+    <w:rPr>
+      <w:rFonts w:asciiTheme="majorHAnsi" w:eastAsiaTheme="majorEastAsia" w:hAnsiTheme="majorHAnsi" w:cstheme="majorBidi"/>
+      <w:color w:val="2F5496" w:themeColor="accent1" w:themeShade="BF"/>
+      <w:sz w:val="32"/>
+      <w:szCs w:val="32"/>
+    </w:rPr>
+  </w:style>
+  <w:style w:type="character" w:styleId="nfaseSutil">
+    <w:name w:val="Subtle Emphasis"/>
+    <w:basedOn w:val="Fontepargpadro"/>
+    <w:uiPriority w:val="19"/>
+    <w:qFormat/>
+    <w:rsid w:val="006B07DA"/>
+    <w:rPr>
+      <w:i/>
+      <w:iCs/>
+      <w:color w:val="404040" w:themeColor="text1" w:themeTint="BF"/>
+    </w:rPr>
+  </w:style>
+  <w:style w:type="character" w:styleId="Forte">
+    <w:name w:val="Strong"/>
+    <w:basedOn w:val="Fontepargpadro"/>
+    <w:uiPriority w:val="22"/>
+    <w:qFormat/>
+    <w:rsid w:val="00212BFB"/>
+    <w:rPr>
+      <w:b/>
+      <w:bCs/>
     </w:rPr>
   </w:style>
 </w:styles>
@@ -15450,15 +16053,6 @@
 </file>
 
 <file path=customXml/item1.xml><?xml version="1.0" encoding="utf-8"?>
-<?mso-contentType ?>
-<FormTemplates xmlns="http://schemas.microsoft.com/sharepoint/v3/contenttype/forms">
-  <Display>DocumentLibraryForm</Display>
-  <Edit>DocumentLibraryForm</Edit>
-  <New>DocumentLibraryForm</New>
-</FormTemplates>
-</file>
-
-<file path=customXml/item2.xml><?xml version="1.0" encoding="utf-8"?>
 <ct:contentTypeSchema xmlns:ct="http://schemas.microsoft.com/office/2006/metadata/contentType" xmlns:ma="http://schemas.microsoft.com/office/2006/metadata/properties/metaAttributes" ct:_="" ma:_="" ma:contentTypeName="Documento" ma:contentTypeID="0x01010034B17ED9C83E394791ACA33DA9287452" ma:contentTypeVersion="16" ma:contentTypeDescription="Crie um novo documento." ma:contentTypeScope="" ma:versionID="d36ce64b1b29120840e9f9b956471cbb">
   <xsd:schema xmlns:xsd="http://www.w3.org/2001/XMLSchema" xmlns:xs="http://www.w3.org/2001/XMLSchema" xmlns:p="http://schemas.microsoft.com/office/2006/metadata/properties" xmlns:ns3="8437a765-f0a9-40aa-978b-fcc06261281f" xmlns:ns4="e78d8b06-d887-4705-9cec-751f2fb2cee2" targetNamespace="http://schemas.microsoft.com/office/2006/metadata/properties" ma:root="true" ma:fieldsID="ab1d645bb15f72c0dfc8a8f602f1de6b" ns3:_="" ns4:_="">
     <xsd:import namespace="8437a765-f0a9-40aa-978b-fcc06261281f"/>
@@ -15697,7 +16291,7 @@
 </ct:contentTypeSchema>
 </file>
 
-<file path=customXml/item3.xml><?xml version="1.0" encoding="utf-8"?>
+<file path=customXml/item2.xml><?xml version="1.0" encoding="utf-8"?>
 <p:properties xmlns:p="http://schemas.microsoft.com/office/2006/metadata/properties" xmlns:xsi="http://www.w3.org/2001/XMLSchema-instance" xmlns:pc="http://schemas.microsoft.com/office/infopath/2007/PartnerControls">
   <documentManagement>
     <_activity xmlns="8437a765-f0a9-40aa-978b-fcc06261281f" xsi:nil="true"/>
@@ -15705,19 +16299,20 @@
 </p:properties>
 </file>
 
+<file path=customXml/item3.xml><?xml version="1.0" encoding="utf-8"?>
+<?mso-contentType ?>
+<FormTemplates xmlns="http://schemas.microsoft.com/sharepoint/v3/contenttype/forms">
+  <Display>DocumentLibraryForm</Display>
+  <Edit>DocumentLibraryForm</Edit>
+  <New>DocumentLibraryForm</New>
+</FormTemplates>
+</file>
+
 <file path=customXml/item4.xml><?xml version="1.0" encoding="utf-8"?>
 <b:Sources xmlns:b="http://schemas.openxmlformats.org/officeDocument/2006/bibliography" xmlns="http://schemas.openxmlformats.org/officeDocument/2006/bibliography" SelectedStyle="\APASixthEditionOfficeOnline.xsl" StyleName="APA" Version="6"/>
 </file>
 
 <file path=customXml/itemProps1.xml><?xml version="1.0" encoding="utf-8"?>
-<ds:datastoreItem xmlns:ds="http://schemas.openxmlformats.org/officeDocument/2006/customXml" ds:itemID="{38630907-5F1E-4561-A45F-AC7CC415CD73}">
-  <ds:schemaRefs>
-    <ds:schemaRef ds:uri="http://schemas.microsoft.com/sharepoint/v3/contenttype/forms"/>
-  </ds:schemaRefs>
-</ds:datastoreItem>
-</file>
-
-<file path=customXml/itemProps2.xml><?xml version="1.0" encoding="utf-8"?>
 <ds:datastoreItem xmlns:ds="http://schemas.openxmlformats.org/officeDocument/2006/customXml" ds:itemID="{5D63F5B6-DF50-4CAF-997C-1D8B1776178E}">
   <ds:schemaRefs>
     <ds:schemaRef ds:uri="http://schemas.microsoft.com/office/2006/metadata/contentType"/>
@@ -15736,7 +16331,7 @@
 </ds:datastoreItem>
 </file>
 
-<file path=customXml/itemProps3.xml><?xml version="1.0" encoding="utf-8"?>
+<file path=customXml/itemProps2.xml><?xml version="1.0" encoding="utf-8"?>
 <ds:datastoreItem xmlns:ds="http://schemas.openxmlformats.org/officeDocument/2006/customXml" ds:itemID="{0C9FFCBC-F2CA-4FF1-AAFC-AD3B89BB1967}">
   <ds:schemaRefs>
     <ds:schemaRef ds:uri="http://schemas.microsoft.com/office/2006/metadata/properties"/>
@@ -15746,8 +16341,16 @@
 </ds:datastoreItem>
 </file>
 
+<file path=customXml/itemProps3.xml><?xml version="1.0" encoding="utf-8"?>
+<ds:datastoreItem xmlns:ds="http://schemas.openxmlformats.org/officeDocument/2006/customXml" ds:itemID="{38630907-5F1E-4561-A45F-AC7CC415CD73}">
+  <ds:schemaRefs>
+    <ds:schemaRef ds:uri="http://schemas.microsoft.com/sharepoint/v3/contenttype/forms"/>
+  </ds:schemaRefs>
+</ds:datastoreItem>
+</file>
+
 <file path=customXml/itemProps4.xml><?xml version="1.0" encoding="utf-8"?>
-<ds:datastoreItem xmlns:ds="http://schemas.openxmlformats.org/officeDocument/2006/customXml" ds:itemID="{1191458A-60D0-4A84-B30B-F0633BBE8B44}">
+<ds:datastoreItem xmlns:ds="http://schemas.openxmlformats.org/officeDocument/2006/customXml" ds:itemID="{954FC7B1-C690-4C9E-AAFE-3E4036742809}">
   <ds:schemaRefs>
     <ds:schemaRef ds:uri="http://schemas.openxmlformats.org/officeDocument/2006/bibliography"/>
   </ds:schemaRefs>

</xml_diff>

<commit_message>
atualização da aula 06/10/26
</commit_message>
<xml_diff>
--- a/apostila/Projeto Space for me3 (Recuperação Automática).docx
+++ b/apostila/Projeto Space for me3 (Recuperação Automática).docx
@@ -14817,8 +14817,698 @@
         </w:rPr>
         <w:t>O objetivo é criar uma transição suave entre as cores das seções.Como o mapa esta localizado entre a seção principal e a seção de beneficios. O degradê cria uma transição visual entre esses diferentes fundos.</w:t>
       </w:r>
+    </w:p>
+    <w:p>
+      <w:pPr>
+        <w:pStyle w:val="SemEspaamento"/>
+        <w:rPr>
+          <w:noProof/>
+        </w:rPr>
+      </w:pPr>
+    </w:p>
+    <w:p>
+      <w:pPr>
+        <w:pStyle w:val="SemEspaamento"/>
+        <w:rPr>
+          <w:noProof/>
+        </w:rPr>
+      </w:pPr>
+      <w:r>
+        <w:rPr>
+          <w:noProof/>
+        </w:rPr>
+        <w:t>115- Testamos o degrade de diversos tipos, com mais de 3 cores usando:</w:t>
+      </w:r>
+    </w:p>
+    <w:p>
+      <w:pPr>
+        <w:pStyle w:val="SemEspaamento"/>
+        <w:rPr>
+          <w:noProof/>
+        </w:rPr>
+      </w:pPr>
+    </w:p>
+    <w:p>
+      <w:pPr>
+        <w:pStyle w:val="SemEspaamento"/>
+        <w:numPr>
+          <w:ilvl w:val="0"/>
+          <w:numId w:val="3"/>
+        </w:numPr>
+        <w:rPr>
+          <w:noProof/>
+        </w:rPr>
+      </w:pPr>
+      <w:r>
+        <w:rPr>
+          <w:noProof/>
+        </w:rPr>
+        <w:t>Background: linear-gradient (orange, blue, red e black).</w:t>
+      </w:r>
+    </w:p>
+    <w:p>
+      <w:pPr>
+        <w:pStyle w:val="SemEspaamento"/>
+        <w:numPr>
+          <w:ilvl w:val="0"/>
+          <w:numId w:val="3"/>
+        </w:numPr>
+        <w:rPr>
+          <w:noProof/>
+        </w:rPr>
+      </w:pPr>
+      <w:r>
+        <w:rPr>
+          <w:noProof/>
+        </w:rPr>
+        <w:t>Colocamos em graus (45deg, orange,blue, black).</w:t>
+      </w:r>
+    </w:p>
+    <w:p>
+      <w:pPr>
+        <w:pStyle w:val="SemEspaamento"/>
+        <w:numPr>
+          <w:ilvl w:val="0"/>
+          <w:numId w:val="3"/>
+        </w:numPr>
+        <w:rPr>
+          <w:noProof/>
+        </w:rPr>
+      </w:pPr>
+      <w:r>
+        <w:rPr>
+          <w:noProof/>
+        </w:rPr>
+        <w:t>Utilizamos porcentagem para cada cor, exemplo (orange 50%, blue, red e black)</w:t>
+      </w:r>
+    </w:p>
+    <w:p>
+      <w:pPr>
+        <w:pStyle w:val="SemEspaamento"/>
+        <w:numPr>
+          <w:ilvl w:val="0"/>
+          <w:numId w:val="3"/>
+        </w:numPr>
+        <w:rPr>
+          <w:noProof/>
+        </w:rPr>
+      </w:pPr>
+      <w:r>
+        <w:rPr>
+          <w:noProof/>
+        </w:rPr>
+        <w:t>E também podemos utilizar o degrade em  círculos: Background: radial-gradient</w:t>
+      </w:r>
+    </w:p>
+    <w:p>
+      <w:pPr>
+        <w:pStyle w:val="SemEspaamento"/>
+        <w:rPr>
+          <w:noProof/>
+        </w:rPr>
+      </w:pPr>
+    </w:p>
+    <w:p>
+      <w:pPr>
+        <w:pStyle w:val="SemEspaamento"/>
+        <w:rPr>
+          <w:noProof/>
+        </w:rPr>
+      </w:pPr>
+      <w:r>
+        <w:rPr>
+          <w:noProof/>
+        </w:rPr>
+        <w:t>116-</w:t>
+      </w:r>
+      <w:r>
+        <w:rPr>
+          <w:noProof/>
+        </w:rPr>
+        <w:t xml:space="preserve"> </w:t>
+      </w:r>
+      <w:r>
+        <w:rPr>
+          <w:b/>
+          <w:noProof/>
+        </w:rPr>
+        <w:t>Opaciadade e Sombra</w:t>
+      </w:r>
+      <w:r>
+        <w:rPr>
+          <w:noProof/>
+        </w:rPr>
+        <w:t xml:space="preserve"> </w:t>
+      </w:r>
+    </w:p>
+    <w:p>
+      <w:pPr>
+        <w:pStyle w:val="SemEspaamento"/>
+        <w:rPr>
+          <w:noProof/>
+        </w:rPr>
+      </w:pPr>
+    </w:p>
+    <w:p>
+      <w:pPr>
+        <w:pStyle w:val="SemEspaamento"/>
+        <w:rPr>
+          <w:noProof/>
+        </w:rPr>
+      </w:pPr>
+      <w:r>
+        <w:rPr>
+          <w:noProof/>
+        </w:rPr>
+        <w:t>O que é opacidade?</w:t>
+      </w:r>
+    </w:p>
+    <w:p>
+      <w:pPr>
+        <w:pStyle w:val="SemEspaamento"/>
+        <w:rPr>
+          <w:noProof/>
+        </w:rPr>
+      </w:pPr>
+      <w:r>
+        <w:rPr>
+          <w:noProof/>
+        </w:rPr>
+        <w:t>É uma camada a mais que coloca em cima do elemento.</w:t>
+      </w:r>
+    </w:p>
+    <w:p>
+      <w:pPr>
+        <w:pStyle w:val="SemEspaamento"/>
+        <w:rPr>
+          <w:noProof/>
+        </w:rPr>
+      </w:pPr>
+    </w:p>
+    <w:p>
+      <w:pPr>
+        <w:pStyle w:val="SemEspaamento"/>
+        <w:rPr>
+          <w:noProof/>
+        </w:rPr>
+      </w:pPr>
+      <w:r>
+        <w:rPr>
+          <w:noProof/>
+        </w:rPr>
+        <w:t>Essa camada ajuda a luz a passar ou não como por exemplo um tipo de insulfilme de um carro que ao se aplicar ajuda a luz do lado de fora a não pssar completamente.</w:t>
+      </w:r>
+    </w:p>
+    <w:p>
+      <w:pPr>
+        <w:pStyle w:val="SemEspaamento"/>
+        <w:rPr>
+          <w:noProof/>
+        </w:rPr>
+      </w:pPr>
+    </w:p>
+    <w:p>
+      <w:pPr>
+        <w:pStyle w:val="SemEspaamento"/>
+        <w:rPr>
+          <w:noProof/>
+        </w:rPr>
+      </w:pPr>
+      <w:r>
+        <w:rPr>
+          <w:noProof/>
+        </w:rPr>
+        <w:t>Na class imagem-beneficios colocamos opacity: 1</w:t>
+      </w:r>
+    </w:p>
+    <w:p>
+      <w:pPr>
+        <w:pStyle w:val="SemEspaamento"/>
+        <w:rPr>
+          <w:noProof/>
+        </w:rPr>
+      </w:pPr>
+    </w:p>
+    <w:p>
+      <w:pPr>
+        <w:pStyle w:val="SemEspaamento"/>
+        <w:rPr>
+          <w:noProof/>
+        </w:rPr>
+      </w:pPr>
+      <w:r>
+        <w:rPr>
+          <w:noProof/>
+        </w:rPr>
+        <w:t>Obs: opacity vai de 1 a 0</w:t>
+      </w:r>
+    </w:p>
+    <w:p>
+      <w:pPr>
+        <w:pStyle w:val="SemEspaamento"/>
+        <w:rPr>
+          <w:noProof/>
+        </w:rPr>
+      </w:pPr>
+    </w:p>
+    <w:p>
+      <w:pPr>
+        <w:pStyle w:val="SemEspaamento"/>
+        <w:rPr>
+          <w:noProof/>
+        </w:rPr>
+      </w:pPr>
+      <w:r>
+        <w:rPr>
+          <w:noProof/>
+        </w:rPr>
+        <w:t>0 – Exibe nada</w:t>
+      </w:r>
+    </w:p>
+    <w:p>
+      <w:pPr>
+        <w:pStyle w:val="SemEspaamento"/>
+        <w:rPr>
+          <w:noProof/>
+        </w:rPr>
+      </w:pPr>
+    </w:p>
+    <w:p>
+      <w:pPr>
+        <w:pStyle w:val="SemEspaamento"/>
+        <w:rPr>
+          <w:noProof/>
+        </w:rPr>
+      </w:pPr>
+      <w:r>
+        <w:rPr>
+          <w:noProof/>
+        </w:rPr>
+        <w:t>1 – Exibe o elemento inteiro</w:t>
+      </w:r>
+    </w:p>
+    <w:p>
+      <w:pPr>
+        <w:pStyle w:val="SemEspaamento"/>
+        <w:rPr>
+          <w:noProof/>
+        </w:rPr>
+      </w:pPr>
+    </w:p>
+    <w:p>
+      <w:pPr>
+        <w:pStyle w:val="SemEspaamento"/>
+        <w:rPr>
+          <w:noProof/>
+        </w:rPr>
+      </w:pPr>
+      <w:r>
+        <w:rPr>
+          <w:noProof/>
+        </w:rPr>
+        <w:t>Então colocamos de 0.3 que exibe 30% ou 0.7 que exibe 70%</w:t>
+      </w:r>
+    </w:p>
+    <w:p>
+      <w:pPr>
+        <w:pStyle w:val="SemEspaamento"/>
+        <w:rPr>
+          <w:noProof/>
+        </w:rPr>
+      </w:pPr>
+    </w:p>
+    <w:p>
+      <w:pPr>
+        <w:pStyle w:val="SemEspaamento"/>
+        <w:rPr>
+          <w:noProof/>
+        </w:rPr>
+      </w:pPr>
+      <w:r>
+        <w:rPr>
+          <w:b/>
+          <w:noProof/>
+        </w:rPr>
+        <w:t>117</w:t>
+      </w:r>
+      <w:r>
+        <w:rPr>
+          <w:noProof/>
+        </w:rPr>
+        <w:t>- Aplicamos opacidade no nosso site utilizando o efeito do hover que ao passar o mouse na imagem beneficios ele fica com apenas 30% de visibilidade e também adicionamos um transition para que ocorra um tempo para essa passagem ao utilizar o hover.</w:t>
+      </w:r>
+    </w:p>
+    <w:p>
+      <w:pPr>
+        <w:pStyle w:val="SemEspaamento"/>
+        <w:rPr>
+          <w:noProof/>
+        </w:rPr>
+      </w:pPr>
+      <w:r>
+        <w:rPr>
+          <w:noProof/>
+        </w:rPr>
+        <w:drawing>
+          <wp:inline distT="0" distB="0" distL="0" distR="0" wp14:anchorId="477B5F43" wp14:editId="63025724">
+            <wp:extent cx="2372056" cy="1524213"/>
+            <wp:effectExtent l="0" t="0" r="9525" b="0"/>
+            <wp:docPr id="216" name="Imagem 216"/>
+            <wp:cNvGraphicFramePr>
+              <a:graphicFrameLocks xmlns:a="http://schemas.openxmlformats.org/drawingml/2006/main" noChangeAspect="1"/>
+            </wp:cNvGraphicFramePr>
+            <a:graphic xmlns:a="http://schemas.openxmlformats.org/drawingml/2006/main">
+              <a:graphicData uri="http://schemas.openxmlformats.org/drawingml/2006/picture">
+                <pic:pic xmlns:pic="http://schemas.openxmlformats.org/drawingml/2006/picture">
+                  <pic:nvPicPr>
+                    <pic:cNvPr id="1" name=""/>
+                    <pic:cNvPicPr/>
+                  </pic:nvPicPr>
+                  <pic:blipFill>
+                    <a:blip r:embed="rId185"/>
+                    <a:stretch>
+                      <a:fillRect/>
+                    </a:stretch>
+                  </pic:blipFill>
+                  <pic:spPr>
+                    <a:xfrm>
+                      <a:off x="0" y="0"/>
+                      <a:ext cx="2372056" cy="1524213"/>
+                    </a:xfrm>
+                    <a:prstGeom prst="rect">
+                      <a:avLst/>
+                    </a:prstGeom>
+                  </pic:spPr>
+                </pic:pic>
+              </a:graphicData>
+            </a:graphic>
+          </wp:inline>
+        </w:drawing>
+      </w:r>
+    </w:p>
+    <w:p>
+      <w:pPr>
+        <w:pStyle w:val="SemEspaamento"/>
+        <w:rPr>
+          <w:noProof/>
+        </w:rPr>
+      </w:pPr>
+    </w:p>
+    <w:p>
+      <w:pPr>
+        <w:pStyle w:val="SemEspaamento"/>
+        <w:rPr>
+          <w:noProof/>
+        </w:rPr>
+      </w:pPr>
+      <w:r>
+        <w:rPr>
+          <w:noProof/>
+        </w:rPr>
+        <w:t>118</w:t>
+      </w:r>
+      <w:r>
+        <w:rPr>
+          <w:b/>
+          <w:noProof/>
+        </w:rPr>
+        <w:t>- Sombra nos elementos</w:t>
+      </w:r>
+    </w:p>
+    <w:p>
+      <w:pPr>
+        <w:pStyle w:val="SemEspaamento"/>
+        <w:rPr>
+          <w:noProof/>
+        </w:rPr>
+      </w:pPr>
+    </w:p>
+    <w:p>
+      <w:pPr>
+        <w:pStyle w:val="SemEspaamento"/>
+        <w:rPr>
+          <w:noProof/>
+        </w:rPr>
+      </w:pPr>
+      <w:r>
+        <w:rPr>
+          <w:noProof/>
+        </w:rPr>
+        <w:t>Como funciona a sombra? E como se coloca uma luz em cima do elemento que vai refletir a sombra em baixo.</w:t>
+      </w:r>
+    </w:p>
+    <w:p>
+      <w:pPr>
+        <w:pStyle w:val="SemEspaamento"/>
+        <w:rPr>
+          <w:noProof/>
+        </w:rPr>
+      </w:pPr>
+    </w:p>
+    <w:p>
+      <w:pPr>
+        <w:pStyle w:val="SemEspaamento"/>
+        <w:rPr>
+          <w:noProof/>
+        </w:rPr>
+      </w:pPr>
+      <w:r>
+        <w:rPr>
+          <w:noProof/>
+        </w:rPr>
+        <w:t xml:space="preserve">Na class imagembeneficios vamo colocar box-shadow que significa sombra em caixa que </w:t>
+      </w:r>
+      <w:r>
+        <w:rPr>
+          <w:noProof/>
+        </w:rPr>
+        <w:t>possui a propriedade do eixo X e Y, parecido com exemplo a baixo.</w:t>
+      </w:r>
+    </w:p>
+    <w:p>
+      <w:pPr>
+        <w:pStyle w:val="SemEspaamento"/>
+        <w:rPr>
+          <w:noProof/>
+        </w:rPr>
+      </w:pPr>
+    </w:p>
+    <w:p>
+      <w:pPr>
+        <w:pStyle w:val="SemEspaamento"/>
+        <w:rPr>
+          <w:noProof/>
+        </w:rPr>
+      </w:pPr>
+      <w:r>
+        <w:rPr>
+          <w:noProof/>
+        </w:rPr>
+        <w:drawing>
+          <wp:inline distT="0" distB="0" distL="0" distR="0" wp14:anchorId="39F4A9AD" wp14:editId="7A1E1953">
+            <wp:extent cx="3258005" cy="1209844"/>
+            <wp:effectExtent l="0" t="0" r="0" b="9525"/>
+            <wp:docPr id="220" name="Imagem 220"/>
+            <wp:cNvGraphicFramePr>
+              <a:graphicFrameLocks xmlns:a="http://schemas.openxmlformats.org/drawingml/2006/main" noChangeAspect="1"/>
+            </wp:cNvGraphicFramePr>
+            <a:graphic xmlns:a="http://schemas.openxmlformats.org/drawingml/2006/main">
+              <a:graphicData uri="http://schemas.openxmlformats.org/drawingml/2006/picture">
+                <pic:pic xmlns:pic="http://schemas.openxmlformats.org/drawingml/2006/picture">
+                  <pic:nvPicPr>
+                    <pic:cNvPr id="1" name=""/>
+                    <pic:cNvPicPr/>
+                  </pic:nvPicPr>
+                  <pic:blipFill>
+                    <a:blip r:embed="rId186"/>
+                    <a:stretch>
+                      <a:fillRect/>
+                    </a:stretch>
+                  </pic:blipFill>
+                  <pic:spPr>
+                    <a:xfrm>
+                      <a:off x="0" y="0"/>
+                      <a:ext cx="3258005" cy="1209844"/>
+                    </a:xfrm>
+                    <a:prstGeom prst="rect">
+                      <a:avLst/>
+                    </a:prstGeom>
+                  </pic:spPr>
+                </pic:pic>
+              </a:graphicData>
+            </a:graphic>
+          </wp:inline>
+        </w:drawing>
+      </w:r>
+      <w:r>
+        <w:rPr>
+          <w:noProof/>
+        </w:rPr>
+        <w:t xml:space="preserve"> </w:t>
+      </w:r>
+    </w:p>
+    <w:p>
+      <w:pPr>
+        <w:pStyle w:val="SemEspaamento"/>
+        <w:rPr>
+          <w:noProof/>
+        </w:rPr>
+      </w:pPr>
+    </w:p>
+    <w:p>
+      <w:pPr>
+        <w:pStyle w:val="SemEspaamento"/>
+        <w:rPr>
+          <w:noProof/>
+        </w:rPr>
+      </w:pPr>
+      <w:r>
+        <w:rPr>
+          <w:noProof/>
+        </w:rPr>
+        <w:t>119- Para espalhar a sombra utilizamos mais um valor chamado bluer.</w:t>
+      </w:r>
+    </w:p>
+    <w:p>
+      <w:pPr>
+        <w:pStyle w:val="SemEspaamento"/>
+        <w:rPr>
+          <w:noProof/>
+        </w:rPr>
+      </w:pPr>
+      <w:r>
+        <w:rPr>
+          <w:noProof/>
+        </w:rPr>
+        <w:drawing>
+          <wp:inline distT="0" distB="0" distL="0" distR="0" wp14:anchorId="71C127A8" wp14:editId="1A1B4EA6">
+            <wp:extent cx="3705225" cy="2152650"/>
+            <wp:effectExtent l="0" t="0" r="9525" b="0"/>
+            <wp:docPr id="222" name="Imagem 222"/>
+            <wp:cNvGraphicFramePr>
+              <a:graphicFrameLocks xmlns:a="http://schemas.openxmlformats.org/drawingml/2006/main" noChangeAspect="1"/>
+            </wp:cNvGraphicFramePr>
+            <a:graphic xmlns:a="http://schemas.openxmlformats.org/drawingml/2006/main">
+              <a:graphicData uri="http://schemas.openxmlformats.org/drawingml/2006/picture">
+                <pic:pic xmlns:pic="http://schemas.openxmlformats.org/drawingml/2006/picture">
+                  <pic:nvPicPr>
+                    <pic:cNvPr id="1" name=""/>
+                    <pic:cNvPicPr/>
+                  </pic:nvPicPr>
+                  <pic:blipFill>
+                    <a:blip r:embed="rId187"/>
+                    <a:stretch>
+                      <a:fillRect/>
+                    </a:stretch>
+                  </pic:blipFill>
+                  <pic:spPr>
+                    <a:xfrm>
+                      <a:off x="0" y="0"/>
+                      <a:ext cx="3705752" cy="2152956"/>
+                    </a:xfrm>
+                    <a:prstGeom prst="rect">
+                      <a:avLst/>
+                    </a:prstGeom>
+                  </pic:spPr>
+                </pic:pic>
+              </a:graphicData>
+            </a:graphic>
+          </wp:inline>
+        </w:drawing>
+      </w:r>
+      <w:r>
+        <w:rPr>
+          <w:noProof/>
+        </w:rPr>
+        <w:drawing>
+          <wp:inline distT="0" distB="0" distL="0" distR="0" wp14:anchorId="19A0A4CB" wp14:editId="42DEC761">
+            <wp:extent cx="3162741" cy="1152686"/>
+            <wp:effectExtent l="0" t="0" r="0" b="9525"/>
+            <wp:docPr id="221" name="Imagem 221"/>
+            <wp:cNvGraphicFramePr>
+              <a:graphicFrameLocks xmlns:a="http://schemas.openxmlformats.org/drawingml/2006/main" noChangeAspect="1"/>
+            </wp:cNvGraphicFramePr>
+            <a:graphic xmlns:a="http://schemas.openxmlformats.org/drawingml/2006/main">
+              <a:graphicData uri="http://schemas.openxmlformats.org/drawingml/2006/picture">
+                <pic:pic xmlns:pic="http://schemas.openxmlformats.org/drawingml/2006/picture">
+                  <pic:nvPicPr>
+                    <pic:cNvPr id="1" name=""/>
+                    <pic:cNvPicPr/>
+                  </pic:nvPicPr>
+                  <pic:blipFill>
+                    <a:blip r:embed="rId188"/>
+                    <a:stretch>
+                      <a:fillRect/>
+                    </a:stretch>
+                  </pic:blipFill>
+                  <pic:spPr>
+                    <a:xfrm>
+                      <a:off x="0" y="0"/>
+                      <a:ext cx="3162741" cy="1152686"/>
+                    </a:xfrm>
+                    <a:prstGeom prst="rect">
+                      <a:avLst/>
+                    </a:prstGeom>
+                  </pic:spPr>
+                </pic:pic>
+              </a:graphicData>
+            </a:graphic>
+          </wp:inline>
+        </w:drawing>
+      </w:r>
+    </w:p>
+    <w:p>
+      <w:pPr>
+        <w:pStyle w:val="SemEspaamento"/>
+        <w:rPr>
+          <w:noProof/>
+        </w:rPr>
+      </w:pPr>
+    </w:p>
+    <w:p>
+      <w:pPr>
+        <w:pStyle w:val="SemEspaamento"/>
+        <w:rPr>
+          <w:noProof/>
+        </w:rPr>
+      </w:pPr>
+      <w:r>
+        <w:rPr>
+          <w:noProof/>
+        </w:rPr>
+        <w:t>120- No box-shadow</w:t>
+      </w:r>
+      <w:r>
+        <w:rPr>
+          <w:noProof/>
+        </w:rPr>
+        <w:t xml:space="preserve"> existe o 4 valor que seria a propriedade que configura a intensidade da borda a partir do tamanho do elemento, isto é, o tamanho da sombra projetada neste caso inserimos 20px.</w:t>
+      </w:r>
       <w:bookmarkStart w:id="0" w:name="_GoBack"/>
       <w:bookmarkEnd w:id="0"/>
+      <w:r>
+        <w:rPr>
+          <w:noProof/>
+        </w:rPr>
+        <w:t xml:space="preserve"> </w:t>
+      </w:r>
+    </w:p>
+    <w:p>
+      <w:pPr>
+        <w:pStyle w:val="SemEspaamento"/>
+        <w:rPr>
+          <w:noProof/>
+        </w:rPr>
+      </w:pPr>
+    </w:p>
+    <w:p>
+      <w:pPr>
+        <w:pStyle w:val="SemEspaamento"/>
+        <w:ind w:left="720"/>
+        <w:rPr>
+          <w:noProof/>
+        </w:rPr>
+      </w:pPr>
     </w:p>
     <w:sectPr>
       <w:pgSz w:w="11906" w:h="16838"/>
@@ -16053,6 +16743,23 @@
 </file>
 
 <file path=customXml/item1.xml><?xml version="1.0" encoding="utf-8"?>
+<p:properties xmlns:p="http://schemas.microsoft.com/office/2006/metadata/properties" xmlns:xsi="http://www.w3.org/2001/XMLSchema-instance" xmlns:pc="http://schemas.microsoft.com/office/infopath/2007/PartnerControls">
+  <documentManagement>
+    <_activity xmlns="8437a765-f0a9-40aa-978b-fcc06261281f" xsi:nil="true"/>
+  </documentManagement>
+</p:properties>
+</file>
+
+<file path=customXml/item2.xml><?xml version="1.0" encoding="utf-8"?>
+<?mso-contentType ?>
+<FormTemplates xmlns="http://schemas.microsoft.com/sharepoint/v3/contenttype/forms">
+  <Display>DocumentLibraryForm</Display>
+  <Edit>DocumentLibraryForm</Edit>
+  <New>DocumentLibraryForm</New>
+</FormTemplates>
+</file>
+
+<file path=customXml/item3.xml><?xml version="1.0" encoding="utf-8"?>
 <ct:contentTypeSchema xmlns:ct="http://schemas.microsoft.com/office/2006/metadata/contentType" xmlns:ma="http://schemas.microsoft.com/office/2006/metadata/properties/metaAttributes" ct:_="" ma:_="" ma:contentTypeName="Documento" ma:contentTypeID="0x01010034B17ED9C83E394791ACA33DA9287452" ma:contentTypeVersion="16" ma:contentTypeDescription="Crie um novo documento." ma:contentTypeScope="" ma:versionID="d36ce64b1b29120840e9f9b956471cbb">
   <xsd:schema xmlns:xsd="http://www.w3.org/2001/XMLSchema" xmlns:xs="http://www.w3.org/2001/XMLSchema" xmlns:p="http://schemas.microsoft.com/office/2006/metadata/properties" xmlns:ns3="8437a765-f0a9-40aa-978b-fcc06261281f" xmlns:ns4="e78d8b06-d887-4705-9cec-751f2fb2cee2" targetNamespace="http://schemas.microsoft.com/office/2006/metadata/properties" ma:root="true" ma:fieldsID="ab1d645bb15f72c0dfc8a8f602f1de6b" ns3:_="" ns4:_="">
     <xsd:import namespace="8437a765-f0a9-40aa-978b-fcc06261281f"/>
@@ -16291,28 +16998,29 @@
 </ct:contentTypeSchema>
 </file>
 
-<file path=customXml/item2.xml><?xml version="1.0" encoding="utf-8"?>
-<p:properties xmlns:p="http://schemas.microsoft.com/office/2006/metadata/properties" xmlns:xsi="http://www.w3.org/2001/XMLSchema-instance" xmlns:pc="http://schemas.microsoft.com/office/infopath/2007/PartnerControls">
-  <documentManagement>
-    <_activity xmlns="8437a765-f0a9-40aa-978b-fcc06261281f" xsi:nil="true"/>
-  </documentManagement>
-</p:properties>
-</file>
-
-<file path=customXml/item3.xml><?xml version="1.0" encoding="utf-8"?>
-<?mso-contentType ?>
-<FormTemplates xmlns="http://schemas.microsoft.com/sharepoint/v3/contenttype/forms">
-  <Display>DocumentLibraryForm</Display>
-  <Edit>DocumentLibraryForm</Edit>
-  <New>DocumentLibraryForm</New>
-</FormTemplates>
-</file>
-
 <file path=customXml/item4.xml><?xml version="1.0" encoding="utf-8"?>
 <b:Sources xmlns:b="http://schemas.openxmlformats.org/officeDocument/2006/bibliography" xmlns="http://schemas.openxmlformats.org/officeDocument/2006/bibliography" SelectedStyle="\APASixthEditionOfficeOnline.xsl" StyleName="APA" Version="6"/>
 </file>
 
 <file path=customXml/itemProps1.xml><?xml version="1.0" encoding="utf-8"?>
+<ds:datastoreItem xmlns:ds="http://schemas.openxmlformats.org/officeDocument/2006/customXml" ds:itemID="{0C9FFCBC-F2CA-4FF1-AAFC-AD3B89BB1967}">
+  <ds:schemaRefs>
+    <ds:schemaRef ds:uri="http://schemas.microsoft.com/office/2006/metadata/properties"/>
+    <ds:schemaRef ds:uri="http://schemas.microsoft.com/office/infopath/2007/PartnerControls"/>
+    <ds:schemaRef ds:uri="8437a765-f0a9-40aa-978b-fcc06261281f"/>
+  </ds:schemaRefs>
+</ds:datastoreItem>
+</file>
+
+<file path=customXml/itemProps2.xml><?xml version="1.0" encoding="utf-8"?>
+<ds:datastoreItem xmlns:ds="http://schemas.openxmlformats.org/officeDocument/2006/customXml" ds:itemID="{38630907-5F1E-4561-A45F-AC7CC415CD73}">
+  <ds:schemaRefs>
+    <ds:schemaRef ds:uri="http://schemas.microsoft.com/sharepoint/v3/contenttype/forms"/>
+  </ds:schemaRefs>
+</ds:datastoreItem>
+</file>
+
+<file path=customXml/itemProps3.xml><?xml version="1.0" encoding="utf-8"?>
 <ds:datastoreItem xmlns:ds="http://schemas.openxmlformats.org/officeDocument/2006/customXml" ds:itemID="{5D63F5B6-DF50-4CAF-997C-1D8B1776178E}">
   <ds:schemaRefs>
     <ds:schemaRef ds:uri="http://schemas.microsoft.com/office/2006/metadata/contentType"/>
@@ -16331,26 +17039,8 @@
 </ds:datastoreItem>
 </file>
 
-<file path=customXml/itemProps2.xml><?xml version="1.0" encoding="utf-8"?>
-<ds:datastoreItem xmlns:ds="http://schemas.openxmlformats.org/officeDocument/2006/customXml" ds:itemID="{0C9FFCBC-F2CA-4FF1-AAFC-AD3B89BB1967}">
-  <ds:schemaRefs>
-    <ds:schemaRef ds:uri="http://schemas.microsoft.com/office/2006/metadata/properties"/>
-    <ds:schemaRef ds:uri="http://schemas.microsoft.com/office/infopath/2007/PartnerControls"/>
-    <ds:schemaRef ds:uri="8437a765-f0a9-40aa-978b-fcc06261281f"/>
-  </ds:schemaRefs>
-</ds:datastoreItem>
-</file>
-
-<file path=customXml/itemProps3.xml><?xml version="1.0" encoding="utf-8"?>
-<ds:datastoreItem xmlns:ds="http://schemas.openxmlformats.org/officeDocument/2006/customXml" ds:itemID="{38630907-5F1E-4561-A45F-AC7CC415CD73}">
-  <ds:schemaRefs>
-    <ds:schemaRef ds:uri="http://schemas.microsoft.com/sharepoint/v3/contenttype/forms"/>
-  </ds:schemaRefs>
-</ds:datastoreItem>
-</file>
-
 <file path=customXml/itemProps4.xml><?xml version="1.0" encoding="utf-8"?>
-<ds:datastoreItem xmlns:ds="http://schemas.openxmlformats.org/officeDocument/2006/customXml" ds:itemID="{954FC7B1-C690-4C9E-AAFE-3E4036742809}">
+<ds:datastoreItem xmlns:ds="http://schemas.openxmlformats.org/officeDocument/2006/customXml" ds:itemID="{52A6C6F7-1657-468B-A4BA-CA54139F3E42}">
   <ds:schemaRefs>
     <ds:schemaRef ds:uri="http://schemas.openxmlformats.org/officeDocument/2006/bibliography"/>
   </ds:schemaRefs>

</xml_diff>